<commit_message>
Documentazione: Activity Diagram in stile UML testbook puro (rif. SunBook)
Sostituisce lo stile colorato con riquadri raggruppati (sfondo giallo per
Offri/Cerca/Gestione Corse) con lo stile bianco e nero, compatto, del
riferimento del corso: rettangoli e rombi bianchi con solo bordo nero,
nessun raggruppamento a riquadro colorato, nodo iniziale a pallino nero
pieno, nodo finale a bullseye (cerchio con centro pieno), timer a
clessidra — stessa logica di flusso di prima, solo la resa visiva
cambia. Nessun impatto sui numeri di pagina dell'indice.
</commit_message>
<xml_diff>
--- a/docs/UniRide_Submission.docx
+++ b/docs/UniRide_Submission.docx
@@ -3220,7 +3220,7 @@
       <w:r>
         <w:drawing>
           <wp:inline distT="0" distB="0" distL="0" distR="0">
-            <wp:extent cx="5715000" cy="5744158"/>
+            <wp:extent cx="5715000" cy="4767360"/>
             <wp:effectExtent t="0" r="0" b="0" l="0"/>
             <wp:docPr id="1" name="" descr="" title=""/>
             <wp:cNvGraphicFramePr>
@@ -3245,7 +3245,7 @@
                   <pic:spPr bwMode="auto">
                     <a:xfrm>
                       <a:off x="0" y="0"/>
-                      <a:ext cx="5715000" cy="5744158"/>
+                      <a:ext cx="5715000" cy="4767360"/>
                     </a:xfrm>
                     <a:prstGeom prst="rect">
                       <a:avLst/>

</xml_diff>

<commit_message>
Documentazione: Sequence e State Diagram in stile UML testbook puro (rif. SunBook)
Come già fatto per l'Activity Diagram, sostituisce lo stile colorato con
la notazione bianco/nero pulita del riferimento del corso:

- Sequence Diagram (Figura 10): rimossi i box colorati di
  raggruppamento Boundary/Control/DAO/Entity; ogni partecipante ha ora
  un'intestazione a due righe (ruolo sopra, nome della classe sotto),
  come nel riferimento. Lifeline e activation bar restano bianco/nero,
  la chiamata asincrona (notifica Observer) mantiene la punta di freccia
  aperta che la distingue dalle chiamate sincrone.
- State Diagram di Ride e Booking (Figure 11-12): rimosso lo sfondo
  grigio dietro le etichette delle transizioni, stati come rettangoli
  bianco/nero puri, nodo iniziale a pallino pieno e nodo finale a
  bullseye invariati.

Indice ricalcolato (la resa più compatta guadagna una pagina).
</commit_message>
<xml_diff>
--- a/docs/UniRide_Submission.docx
+++ b/docs/UniRide_Submission.docx
@@ -259,7 +259,7 @@
       <w:r>
         <w:t xml:space="preserve">DELIVERABLE LINKS</w:t>
         <w:ptab w:alignment="right" w:relativeTo="margin" w:leader="dot"/>
-        <w:t xml:space="preserve">22</w:t>
+        <w:t xml:space="preserve">21</w:t>
       </w:r>
     </w:p>
     <w:p>
@@ -3299,7 +3299,7 @@
       <w:r>
         <w:drawing>
           <wp:inline distT="0" distB="0" distL="0" distR="0">
-            <wp:extent cx="5715000" cy="4452730"/>
+            <wp:extent cx="5715000" cy="4532243"/>
             <wp:effectExtent t="0" r="0" b="0" l="0"/>
             <wp:docPr id="1" name="" descr="" title=""/>
             <wp:cNvGraphicFramePr>
@@ -3324,7 +3324,7 @@
                   <pic:spPr bwMode="auto">
                     <a:xfrm>
                       <a:off x="0" y="0"/>
-                      <a:ext cx="5715000" cy="4452730"/>
+                      <a:ext cx="5715000" cy="4532243"/>
                     </a:xfrm>
                     <a:prstGeom prst="rect">
                       <a:avLst/>
@@ -3378,7 +3378,7 @@
       <w:r>
         <w:drawing>
           <wp:inline distT="0" distB="0" distL="0" distR="0">
-            <wp:extent cx="4572000" cy="3631842"/>
+            <wp:extent cx="4572000" cy="3716642"/>
             <wp:effectExtent t="0" r="0" b="0" l="0"/>
             <wp:docPr id="1" name="" descr="" title=""/>
             <wp:cNvGraphicFramePr>
@@ -3403,7 +3403,7 @@
                   <pic:spPr bwMode="auto">
                     <a:xfrm>
                       <a:off x="0" y="0"/>
-                      <a:ext cx="4572000" cy="3631842"/>
+                      <a:ext cx="4572000" cy="3716642"/>
                     </a:xfrm>
                     <a:prstGeom prst="rect">
                       <a:avLst/>
@@ -3448,7 +3448,7 @@
       <w:r>
         <w:drawing>
           <wp:inline distT="0" distB="0" distL="0" distR="0">
-            <wp:extent cx="3657600" cy="4594087"/>
+            <wp:extent cx="3657600" cy="3411761"/>
             <wp:effectExtent t="0" r="0" b="0" l="0"/>
             <wp:docPr id="1" name="" descr="" title=""/>
             <wp:cNvGraphicFramePr>
@@ -3473,7 +3473,7 @@
                   <pic:spPr bwMode="auto">
                     <a:xfrm>
                       <a:off x="0" y="0"/>
-                      <a:ext cx="3657600" cy="4594087"/>
+                      <a:ext cx="3657600" cy="3411761"/>
                     </a:xfrm>
                     <a:prstGeom prst="rect">
                       <a:avLst/>

</xml_diff>

<commit_message>
Documentazione: FR ridotti a 4 in stile 'shall' più glossario (rif. SunBook)
I 16 FR atomici (introdotti per il feedback A1 'non atomici e troppo
lunghi') erano più granulari del necessario: molti erano solo regole di
validazione di una capacità già coperta da un altro FR, non capacità
distinte. Sostituiti con 4 FR brevi, una frase ciascuno, in stile
'Il sistema consente...' come nel riferimento del corso:

- FR-1 Autenticazione
- FR-2 Gestione Passaggio
- FR-3 Prenotazione
- FR-4 Gestione delle Richieste

Aggiunto un Glossario dei termini di dominio (Passaggio, Richiesta di
Prenotazione, Ateneo più vicino, Stato del Passaggio, Stato della
Richiesta), anch'esso ripreso dal formato del riferimento.

Indice ricalcolato (contenuto più compatto, -2 pagine).
</commit_message>
<xml_diff>
--- a/docs/UniRide_Submission.docx
+++ b/docs/UniRide_Submission.docx
@@ -149,7 +149,7 @@
       <w:r>
         <w:t xml:space="preserve">1.4. Use Cases</w:t>
         <w:ptab w:alignment="right" w:relativeTo="margin" w:leader="dot"/>
-        <w:t xml:space="preserve">8</w:t>
+        <w:t xml:space="preserve">6</w:t>
       </w:r>
     </w:p>
     <w:p>
@@ -160,7 +160,7 @@
       <w:r>
         <w:t xml:space="preserve">2. STORYBOARDS</w:t>
         <w:ptab w:alignment="right" w:relativeTo="margin" w:leader="dot"/>
-        <w:t xml:space="preserve">9</w:t>
+        <w:t xml:space="preserve">7</w:t>
       </w:r>
     </w:p>
     <w:p>
@@ -171,7 +171,7 @@
       <w:r>
         <w:t xml:space="preserve">3. DESIGN</w:t>
         <w:ptab w:alignment="right" w:relativeTo="margin" w:leader="dot"/>
-        <w:t xml:space="preserve">11</w:t>
+        <w:t xml:space="preserve">9</w:t>
       </w:r>
     </w:p>
     <w:p>
@@ -182,7 +182,7 @@
       <w:r>
         <w:t xml:space="preserve">3.1. Class Diagram — VOPC (Analysis)</w:t>
         <w:ptab w:alignment="right" w:relativeTo="margin" w:leader="dot"/>
-        <w:t xml:space="preserve">11</w:t>
+        <w:t xml:space="preserve">9</w:t>
       </w:r>
     </w:p>
     <w:p>
@@ -193,7 +193,7 @@
       <w:r>
         <w:t xml:space="preserve">3.2. Class Diagram — Design Level</w:t>
         <w:ptab w:alignment="right" w:relativeTo="margin" w:leader="dot"/>
-        <w:t xml:space="preserve">15</w:t>
+        <w:t xml:space="preserve">13</w:t>
       </w:r>
     </w:p>
     <w:p>
@@ -204,7 +204,7 @@
       <w:r>
         <w:t xml:space="preserve">3.3. Design Patterns</w:t>
         <w:ptab w:alignment="right" w:relativeTo="margin" w:leader="dot"/>
-        <w:t xml:space="preserve">16</w:t>
+        <w:t xml:space="preserve">14</w:t>
       </w:r>
     </w:p>
     <w:p>
@@ -215,7 +215,7 @@
       <w:r>
         <w:t xml:space="preserve">3.4. Activity Diagram</w:t>
         <w:ptab w:alignment="right" w:relativeTo="margin" w:leader="dot"/>
-        <w:t xml:space="preserve">17</w:t>
+        <w:t xml:space="preserve">15</w:t>
       </w:r>
     </w:p>
     <w:p>
@@ -226,7 +226,7 @@
       <w:r>
         <w:t xml:space="preserve">3.5. Sequence Diagram</w:t>
         <w:ptab w:alignment="right" w:relativeTo="margin" w:leader="dot"/>
-        <w:t xml:space="preserve">18</w:t>
+        <w:t xml:space="preserve">16</w:t>
       </w:r>
     </w:p>
     <w:p>
@@ -237,7 +237,7 @@
       <w:r>
         <w:t xml:space="preserve">3.6. State Diagram</w:t>
         <w:ptab w:alignment="right" w:relativeTo="margin" w:leader="dot"/>
-        <w:t xml:space="preserve">19</w:t>
+        <w:t xml:space="preserve">17</w:t>
       </w:r>
     </w:p>
     <w:p>
@@ -248,7 +248,7 @@
       <w:r>
         <w:t xml:space="preserve">4. TESTING</w:t>
         <w:ptab w:alignment="right" w:relativeTo="margin" w:leader="dot"/>
-        <w:t xml:space="preserve">21</w:t>
+        <w:t xml:space="preserve">19</w:t>
       </w:r>
     </w:p>
     <w:p>
@@ -259,7 +259,7 @@
       <w:r>
         <w:t xml:space="preserve">DELIVERABLE LINKS</w:t>
         <w:ptab w:alignment="right" w:relativeTo="margin" w:leader="dot"/>
-        <w:t xml:space="preserve">21</w:t>
+        <w:t xml:space="preserve">19</w:t>
       </w:r>
     </w:p>
     <w:p>
@@ -1145,12 +1145,12 @@
                 <w:b/>
                 <w:bCs/>
               </w:rPr>
-              <w:t xml:space="preserve">FR-1 — Registrazione</w:t>
-            </w:r>
-          </w:p>
-          <w:p>
-            <w:r>
-              <w:t xml:space="preserve">Il sistema consente a un utente di registrarsi fornendo nome e cognome, username e password.</w:t>
+              <w:t xml:space="preserve">FR-1 — Autenticazione</w:t>
+            </w:r>
+          </w:p>
+          <w:p>
+            <w:r>
+              <w:t xml:space="preserve">Il sistema consente a uno studente di registrarsi con username, password e dati anagrafici, e di accedere con le proprie credenziali.</w:t>
             </w:r>
           </w:p>
         </w:tc>
@@ -1200,12 +1200,12 @@
                 <w:b/>
                 <w:bCs/>
               </w:rPr>
-              <w:t xml:space="preserve">FR-2 — Vincolo sulla password</w:t>
-            </w:r>
-          </w:p>
-          <w:p>
-            <w:r>
-              <w:t xml:space="preserve">La password inserita in fase di registrazione deve essere di almeno 6 caratteri, altrimenti la registrazione viene rifiutata.</w:t>
+              <w:t xml:space="preserve">FR-2 — Gestione Passaggio</w:t>
+            </w:r>
+          </w:p>
+          <w:p>
+            <w:r>
+              <w:t xml:space="preserve">Il sistema consente a un guidatore autenticato di pubblicare, completare o annullare un proprio passaggio.</w:t>
             </w:r>
           </w:p>
         </w:tc>
@@ -1255,12 +1255,12 @@
                 <w:b/>
                 <w:bCs/>
               </w:rPr>
-              <w:t xml:space="preserve">FR-3 — Unicità dello username</w:t>
-            </w:r>
-          </w:p>
-          <w:p>
-            <w:r>
-              <w:t xml:space="preserve">Uno username già presente nel sistema non può essere riutilizzato per una nuova registrazione.</w:t>
+              <w:t xml:space="preserve">FR-3 — Prenotazione</w:t>
+            </w:r>
+          </w:p>
+          <w:p>
+            <w:r>
+              <w:t xml:space="preserve">Il sistema consente a un passeggero autenticato di cercare un passaggio disponibile e richiedere un posto, riservato immediatamente.</w:t>
             </w:r>
           </w:p>
         </w:tc>
@@ -1310,12 +1310,12 @@
                 <w:b/>
                 <w:bCs/>
               </w:rPr>
-              <w:t xml:space="preserve">FR-4 — Dati di contatto facoltativi</w:t>
-            </w:r>
-          </w:p>
-          <w:p>
-            <w:r>
-              <w:t xml:space="preserve">In fase di registrazione lo studente può dichiarare, facoltativamente, il proprio comune di residenza e un numero di telefono; se compilati, entrambi vengono convalidati nel formato.</w:t>
+              <w:t xml:space="preserve">FR-4 — Gestione delle Richieste</w:t>
+            </w:r>
+          </w:p>
+          <w:p>
+            <w:r>
+              <w:t xml:space="preserve">Il sistema consente al guidatore di confermare o rifiutare una richiesta di prenotazione, e a entrambe le parti di annullarla in qualunque momento.</w:t>
             </w:r>
           </w:p>
         </w:tc>
@@ -1323,664 +1323,93 @@
     </w:tbl>
     <w:p>
       <w:pPr>
-        <w:pStyle w:val="Heading3"/>
-        <w:spacing w:after="100" w:before="220"/>
-      </w:pPr>
-      <w:r>
-        <w:t xml:space="preserve">1.3.5. FR-5</w:t>
-      </w:r>
-    </w:p>
-    <w:tbl>
-      <w:tblPr>
-        <w:tblW w:type="pct" w:w="100%"/>
-        <w:tblBorders>
-          <w:top w:val="single" w:color="2f855a" w:sz="4"/>
-          <w:left w:val="single" w:color="2f855a" w:sz="4"/>
-          <w:bottom w:val="single" w:color="2f855a" w:sz="4"/>
-          <w:right w:val="single" w:color="2f855a" w:sz="4"/>
-          <w:insideH w:val="single" w:color="auto" w:sz="4"/>
-          <w:insideV w:val="single" w:color="auto" w:sz="4"/>
-        </w:tblBorders>
-      </w:tblPr>
-      <w:tblGrid>
-        <w:gridCol w:w="100"/>
-      </w:tblGrid>
-      <w:tr>
-        <w:tc>
-          <w:tcPr>
-            <w:shd w:fill="F0FBF3" w:val="clear"/>
-            <w:tcMar>
-              <w:top w:type="dxa" w:w="160"/>
-              <w:left w:type="dxa" w:w="200"/>
-              <w:bottom w:type="dxa" w:w="160"/>
-              <w:right w:type="dxa" w:w="200"/>
-            </w:tcMar>
-          </w:tcPr>
-          <w:p>
-            <w:pPr>
-              <w:spacing w:after="100"/>
-            </w:pPr>
-            <w:r>
-              <w:rPr>
-                <w:b/>
-                <w:bCs/>
-              </w:rPr>
-              <w:t xml:space="preserve">FR-5 — Visibilità del telefono</w:t>
-            </w:r>
-          </w:p>
-          <w:p>
-            <w:r>
-              <w:t xml:space="preserve">Il numero di telefono di uno studente non compare mai in un elenco di ricerca pubblico: diventa visibile alla controparte solo quando esiste già una richiesta di passaggio concreta fra i due, in 'Le Mie Corse'.</w:t>
-            </w:r>
-          </w:p>
-        </w:tc>
-      </w:tr>
-    </w:tbl>
-    <w:p>
-      <w:pPr>
-        <w:pStyle w:val="Heading3"/>
-        <w:spacing w:after="100" w:before="220"/>
-      </w:pPr>
-      <w:r>
-        <w:t xml:space="preserve">1.3.6. FR-6</w:t>
-      </w:r>
-    </w:p>
-    <w:tbl>
-      <w:tblPr>
-        <w:tblW w:type="pct" w:w="100%"/>
-        <w:tblBorders>
-          <w:top w:val="single" w:color="2f855a" w:sz="4"/>
-          <w:left w:val="single" w:color="2f855a" w:sz="4"/>
-          <w:bottom w:val="single" w:color="2f855a" w:sz="4"/>
-          <w:right w:val="single" w:color="2f855a" w:sz="4"/>
-          <w:insideH w:val="single" w:color="auto" w:sz="4"/>
-          <w:insideV w:val="single" w:color="auto" w:sz="4"/>
-        </w:tblBorders>
-      </w:tblPr>
-      <w:tblGrid>
-        <w:gridCol w:w="100"/>
-      </w:tblGrid>
-      <w:tr>
-        <w:tc>
-          <w:tcPr>
-            <w:shd w:fill="F0FBF3" w:val="clear"/>
-            <w:tcMar>
-              <w:top w:type="dxa" w:w="160"/>
-              <w:left w:type="dxa" w:w="200"/>
-              <w:bottom w:type="dxa" w:w="160"/>
-              <w:right w:type="dxa" w:w="200"/>
-            </w:tcMar>
-          </w:tcPr>
-          <w:p>
-            <w:pPr>
-              <w:spacing w:after="100"/>
-            </w:pPr>
-            <w:r>
-              <w:rPr>
-                <w:b/>
-                <w:bCs/>
-              </w:rPr>
-              <w:t xml:space="preserve">FR-6 — Login</w:t>
-            </w:r>
-          </w:p>
-          <w:p>
-            <w:r>
-              <w:t xml:space="preserve">Il sistema consente a uno studente registrato di accedere con username e password, raggiungendo la propria dashboard personale.</w:t>
-            </w:r>
-          </w:p>
-        </w:tc>
-      </w:tr>
-    </w:tbl>
-    <w:p>
-      <w:pPr>
-        <w:pStyle w:val="Heading3"/>
-        <w:spacing w:after="100" w:before="220"/>
-      </w:pPr>
-      <w:r>
-        <w:t xml:space="preserve">1.3.7. FR-7</w:t>
-      </w:r>
-    </w:p>
-    <w:tbl>
-      <w:tblPr>
-        <w:tblW w:type="pct" w:w="100%"/>
-        <w:tblBorders>
-          <w:top w:val="single" w:color="2f855a" w:sz="4"/>
-          <w:left w:val="single" w:color="2f855a" w:sz="4"/>
-          <w:bottom w:val="single" w:color="2f855a" w:sz="4"/>
-          <w:right w:val="single" w:color="2f855a" w:sz="4"/>
-          <w:insideH w:val="single" w:color="auto" w:sz="4"/>
-          <w:insideV w:val="single" w:color="auto" w:sz="4"/>
-        </w:tblBorders>
-      </w:tblPr>
-      <w:tblGrid>
-        <w:gridCol w:w="100"/>
-      </w:tblGrid>
-      <w:tr>
-        <w:tc>
-          <w:tcPr>
-            <w:shd w:fill="F0FBF3" w:val="clear"/>
-            <w:tcMar>
-              <w:top w:type="dxa" w:w="160"/>
-              <w:left w:type="dxa" w:w="200"/>
-              <w:bottom w:type="dxa" w:w="160"/>
-              <w:right w:type="dxa" w:w="200"/>
-            </w:tcMar>
-          </w:tcPr>
-          <w:p>
-            <w:pPr>
-              <w:spacing w:after="100"/>
-            </w:pPr>
-            <w:r>
-              <w:rPr>
-                <w:b/>
-                <w:bCs/>
-              </w:rPr>
-              <w:t xml:space="preserve">FR-7 — Pubblicazione di un passaggio</w:t>
-            </w:r>
-          </w:p>
-          <w:p>
-            <w:r>
-              <w:t xml:space="preserve">Il sistema consente a un guidatore autenticato di pubblicare un nuovo passaggio specificando partenza, destinazione, data, orario di partenza, posti disponibili e costo base.</w:t>
-            </w:r>
-          </w:p>
-        </w:tc>
-      </w:tr>
-    </w:tbl>
-    <w:p>
-      <w:pPr>
-        <w:pStyle w:val="Heading3"/>
-        <w:spacing w:after="100" w:before="220"/>
-      </w:pPr>
-      <w:r>
-        <w:t xml:space="preserve">1.3.8. FR-8</w:t>
-      </w:r>
-    </w:p>
-    <w:tbl>
-      <w:tblPr>
-        <w:tblW w:type="pct" w:w="100%"/>
-        <w:tblBorders>
-          <w:top w:val="single" w:color="2f855a" w:sz="4"/>
-          <w:left w:val="single" w:color="2f855a" w:sz="4"/>
-          <w:bottom w:val="single" w:color="2f855a" w:sz="4"/>
-          <w:right w:val="single" w:color="2f855a" w:sz="4"/>
-          <w:insideH w:val="single" w:color="auto" w:sz="4"/>
-          <w:insideV w:val="single" w:color="auto" w:sz="4"/>
-        </w:tblBorders>
-      </w:tblPr>
-      <w:tblGrid>
-        <w:gridCol w:w="100"/>
-      </w:tblGrid>
-      <w:tr>
-        <w:tc>
-          <w:tcPr>
-            <w:shd w:fill="F0FBF3" w:val="clear"/>
-            <w:tcMar>
-              <w:top w:type="dxa" w:w="160"/>
-              <w:left w:type="dxa" w:w="200"/>
-              <w:bottom w:type="dxa" w:w="160"/>
-              <w:right w:type="dxa" w:w="200"/>
-            </w:tcMar>
-          </w:tcPr>
-          <w:p>
-            <w:pPr>
-              <w:spacing w:after="100"/>
-            </w:pPr>
-            <w:r>
-              <w:rPr>
-                <w:b/>
-                <w:bCs/>
-              </w:rPr>
-              <w:t xml:space="preserve">FR-8 — Validazione del passaggio</w:t>
-            </w:r>
-          </w:p>
-          <w:p>
-            <w:r>
-              <w:t xml:space="preserve">Un passaggio con partenza uguale alla destinazione, con un numero di posti non maggiore di zero, con un costo base negativo o con un orario di partenza in formato non valido (diverso da HH:mm) viene rifiutato.</w:t>
-            </w:r>
-          </w:p>
-        </w:tc>
-      </w:tr>
-    </w:tbl>
-    <w:p>
-      <w:pPr>
-        <w:pStyle w:val="Heading3"/>
-        <w:spacing w:after="100" w:before="220"/>
-      </w:pPr>
-      <w:r>
-        <w:t xml:space="preserve">1.3.9. FR-9</w:t>
-      </w:r>
-    </w:p>
-    <w:tbl>
-      <w:tblPr>
-        <w:tblW w:type="pct" w:w="100%"/>
-        <w:tblBorders>
-          <w:top w:val="single" w:color="2f855a" w:sz="4"/>
-          <w:left w:val="single" w:color="2f855a" w:sz="4"/>
-          <w:bottom w:val="single" w:color="2f855a" w:sz="4"/>
-          <w:right w:val="single" w:color="2f855a" w:sz="4"/>
-          <w:insideH w:val="single" w:color="auto" w:sz="4"/>
-          <w:insideV w:val="single" w:color="auto" w:sz="4"/>
-        </w:tblBorders>
-      </w:tblPr>
-      <w:tblGrid>
-        <w:gridCol w:w="100"/>
-      </w:tblGrid>
-      <w:tr>
-        <w:tc>
-          <w:tcPr>
-            <w:shd w:fill="F0FBF3" w:val="clear"/>
-            <w:tcMar>
-              <w:top w:type="dxa" w:w="160"/>
-              <w:left w:type="dxa" w:w="200"/>
-              <w:bottom w:type="dxa" w:w="160"/>
-              <w:right w:type="dxa" w:w="200"/>
-            </w:tcMar>
-          </w:tcPr>
-          <w:p>
-            <w:pPr>
-              <w:spacing w:after="100"/>
-            </w:pPr>
-            <w:r>
-              <w:rPr>
-                <w:b/>
-                <w:bCs/>
-              </w:rPr>
-              <w:t xml:space="preserve">FR-9 — Ricerca di un passaggio</w:t>
-            </w:r>
-          </w:p>
-          <w:p>
-            <w:r>
-              <w:t xml:space="preserve">Il sistema consente a uno studente di cercare i passaggi disponibili filtrando per partenza e destinazione.</w:t>
-            </w:r>
-          </w:p>
-        </w:tc>
-      </w:tr>
-    </w:tbl>
-    <w:p>
-      <w:pPr>
-        <w:pStyle w:val="Heading3"/>
-        <w:spacing w:after="100" w:before="220"/>
-      </w:pPr>
-      <w:r>
-        <w:t xml:space="preserve">1.3.10. FR-10</w:t>
-      </w:r>
-    </w:p>
-    <w:tbl>
-      <w:tblPr>
-        <w:tblW w:type="pct" w:w="100%"/>
-        <w:tblBorders>
-          <w:top w:val="single" w:color="2f855a" w:sz="4"/>
-          <w:left w:val="single" w:color="2f855a" w:sz="4"/>
-          <w:bottom w:val="single" w:color="2f855a" w:sz="4"/>
-          <w:right w:val="single" w:color="2f855a" w:sz="4"/>
-          <w:insideH w:val="single" w:color="auto" w:sz="4"/>
-          <w:insideV w:val="single" w:color="auto" w:sz="4"/>
-        </w:tblBorders>
-      </w:tblPr>
-      <w:tblGrid>
-        <w:gridCol w:w="100"/>
-      </w:tblGrid>
-      <w:tr>
-        <w:tc>
-          <w:tcPr>
-            <w:shd w:fill="F0FBF3" w:val="clear"/>
-            <w:tcMar>
-              <w:top w:type="dxa" w:w="160"/>
-              <w:left w:type="dxa" w:w="200"/>
-              <w:bottom w:type="dxa" w:w="160"/>
-              <w:right w:type="dxa" w:w="200"/>
-            </w:tcMar>
-          </w:tcPr>
-          <w:p>
-            <w:pPr>
-              <w:spacing w:after="100"/>
-            </w:pPr>
-            <w:r>
-              <w:rPr>
-                <w:b/>
-                <w:bCs/>
-              </w:rPr>
-              <w:t xml:space="preserve">FR-10 — Richiesta di prenotazione</w:t>
-            </w:r>
-          </w:p>
-          <w:p>
-            <w:r>
-              <w:t xml:space="preserve">Il sistema consente a un passeggero autenticato di richiedere un posto su un passaggio con disponibilità; il posto viene riservato immediatamente, prima ancora della decisione del guidatore.</w:t>
-            </w:r>
-          </w:p>
-        </w:tc>
-      </w:tr>
-    </w:tbl>
-    <w:p>
-      <w:pPr>
-        <w:pStyle w:val="Heading3"/>
-        <w:spacing w:after="100" w:before="220"/>
-      </w:pPr>
-      <w:r>
-        <w:t xml:space="preserve">1.3.11. FR-11</w:t>
-      </w:r>
-    </w:p>
-    <w:tbl>
-      <w:tblPr>
-        <w:tblW w:type="pct" w:w="100%"/>
-        <w:tblBorders>
-          <w:top w:val="single" w:color="2f855a" w:sz="4"/>
-          <w:left w:val="single" w:color="2f855a" w:sz="4"/>
-          <w:bottom w:val="single" w:color="2f855a" w:sz="4"/>
-          <w:right w:val="single" w:color="2f855a" w:sz="4"/>
-          <w:insideH w:val="single" w:color="auto" w:sz="4"/>
-          <w:insideV w:val="single" w:color="auto" w:sz="4"/>
-        </w:tblBorders>
-      </w:tblPr>
-      <w:tblGrid>
-        <w:gridCol w:w="100"/>
-      </w:tblGrid>
-      <w:tr>
-        <w:tc>
-          <w:tcPr>
-            <w:shd w:fill="F0FBF3" w:val="clear"/>
-            <w:tcMar>
-              <w:top w:type="dxa" w:w="160"/>
-              <w:left w:type="dxa" w:w="200"/>
-              <w:bottom w:type="dxa" w:w="160"/>
-              <w:right w:type="dxa" w:w="200"/>
-            </w:tcMar>
-          </w:tcPr>
-          <w:p>
-            <w:pPr>
-              <w:spacing w:after="100"/>
-            </w:pPr>
-            <w:r>
-              <w:rPr>
-                <w:b/>
-                <w:bCs/>
-              </w:rPr>
-              <w:t xml:space="preserve">FR-11 — Vincoli sulla richiesta</w:t>
-            </w:r>
-          </w:p>
-          <w:p>
-            <w:r>
-              <w:t xml:space="preserve">Un guidatore non può richiedere un posto sul proprio stesso passaggio, né un passeggero può inviare una seconda richiesta attiva sulla stessa corsa.</w:t>
-            </w:r>
-          </w:p>
-        </w:tc>
-      </w:tr>
-    </w:tbl>
-    <w:p>
-      <w:pPr>
-        <w:pStyle w:val="Heading3"/>
-        <w:spacing w:after="100" w:before="220"/>
-      </w:pPr>
-      <w:r>
-        <w:t xml:space="preserve">1.3.12. FR-12</w:t>
-      </w:r>
-    </w:p>
-    <w:tbl>
-      <w:tblPr>
-        <w:tblW w:type="pct" w:w="100%"/>
-        <w:tblBorders>
-          <w:top w:val="single" w:color="2f855a" w:sz="4"/>
-          <w:left w:val="single" w:color="2f855a" w:sz="4"/>
-          <w:bottom w:val="single" w:color="2f855a" w:sz="4"/>
-          <w:right w:val="single" w:color="2f855a" w:sz="4"/>
-          <w:insideH w:val="single" w:color="auto" w:sz="4"/>
-          <w:insideV w:val="single" w:color="auto" w:sz="4"/>
-        </w:tblBorders>
-      </w:tblPr>
-      <w:tblGrid>
-        <w:gridCol w:w="100"/>
-      </w:tblGrid>
-      <w:tr>
-        <w:tc>
-          <w:tcPr>
-            <w:shd w:fill="F0FBF3" w:val="clear"/>
-            <w:tcMar>
-              <w:top w:type="dxa" w:w="160"/>
-              <w:left w:type="dxa" w:w="200"/>
-              <w:bottom w:type="dxa" w:w="160"/>
-              <w:right w:type="dxa" w:w="200"/>
-            </w:tcMar>
-          </w:tcPr>
-          <w:p>
-            <w:pPr>
-              <w:spacing w:after="100"/>
-            </w:pPr>
-            <w:r>
-              <w:rPr>
-                <w:b/>
-                <w:bCs/>
-              </w:rPr>
-              <w:t xml:space="preserve">FR-12 — Conferma della richiesta</w:t>
-            </w:r>
-          </w:p>
-          <w:p>
-            <w:r>
-              <w:t xml:space="preserve">Il sistema consente al guidatore di confermare una richiesta di prenotazione pendente sulla propria corsa.</w:t>
-            </w:r>
-          </w:p>
-        </w:tc>
-      </w:tr>
-    </w:tbl>
-    <w:p>
-      <w:pPr>
-        <w:pStyle w:val="Heading3"/>
-        <w:spacing w:after="100" w:before="220"/>
-      </w:pPr>
-      <w:r>
-        <w:t xml:space="preserve">1.3.13. FR-13</w:t>
-      </w:r>
-    </w:p>
-    <w:tbl>
-      <w:tblPr>
-        <w:tblW w:type="pct" w:w="100%"/>
-        <w:tblBorders>
-          <w:top w:val="single" w:color="2f855a" w:sz="4"/>
-          <w:left w:val="single" w:color="2f855a" w:sz="4"/>
-          <w:bottom w:val="single" w:color="2f855a" w:sz="4"/>
-          <w:right w:val="single" w:color="2f855a" w:sz="4"/>
-          <w:insideH w:val="single" w:color="auto" w:sz="4"/>
-          <w:insideV w:val="single" w:color="auto" w:sz="4"/>
-        </w:tblBorders>
-      </w:tblPr>
-      <w:tblGrid>
-        <w:gridCol w:w="100"/>
-      </w:tblGrid>
-      <w:tr>
-        <w:tc>
-          <w:tcPr>
-            <w:shd w:fill="F0FBF3" w:val="clear"/>
-            <w:tcMar>
-              <w:top w:type="dxa" w:w="160"/>
-              <w:left w:type="dxa" w:w="200"/>
-              <w:bottom w:type="dxa" w:w="160"/>
-              <w:right w:type="dxa" w:w="200"/>
-            </w:tcMar>
-          </w:tcPr>
-          <w:p>
-            <w:pPr>
-              <w:spacing w:after="100"/>
-            </w:pPr>
-            <w:r>
-              <w:rPr>
-                <w:b/>
-                <w:bCs/>
-              </w:rPr>
-              <w:t xml:space="preserve">FR-13 — Rifiuto della richiesta</w:t>
-            </w:r>
-          </w:p>
-          <w:p>
-            <w:r>
-              <w:t xml:space="preserve">Il sistema consente al guidatore di rifiutare una richiesta di prenotazione pendente sulla propria corsa, liberando il posto già riservato.</w:t>
-            </w:r>
-          </w:p>
-        </w:tc>
-      </w:tr>
-    </w:tbl>
-    <w:p>
-      <w:pPr>
-        <w:pStyle w:val="Heading3"/>
-        <w:spacing w:after="100" w:before="220"/>
-      </w:pPr>
-      <w:r>
-        <w:t xml:space="preserve">1.3.14. FR-14</w:t>
-      </w:r>
-    </w:p>
-    <w:tbl>
-      <w:tblPr>
-        <w:tblW w:type="pct" w:w="100%"/>
-        <w:tblBorders>
-          <w:top w:val="single" w:color="2f855a" w:sz="4"/>
-          <w:left w:val="single" w:color="2f855a" w:sz="4"/>
-          <w:bottom w:val="single" w:color="2f855a" w:sz="4"/>
-          <w:right w:val="single" w:color="2f855a" w:sz="4"/>
-          <w:insideH w:val="single" w:color="auto" w:sz="4"/>
-          <w:insideV w:val="single" w:color="auto" w:sz="4"/>
-        </w:tblBorders>
-      </w:tblPr>
-      <w:tblGrid>
-        <w:gridCol w:w="100"/>
-      </w:tblGrid>
-      <w:tr>
-        <w:tc>
-          <w:tcPr>
-            <w:shd w:fill="F0FBF3" w:val="clear"/>
-            <w:tcMar>
-              <w:top w:type="dxa" w:w="160"/>
-              <w:left w:type="dxa" w:w="200"/>
-              <w:bottom w:type="dxa" w:w="160"/>
-              <w:right w:type="dxa" w:w="200"/>
-            </w:tcMar>
-          </w:tcPr>
-          <w:p>
-            <w:pPr>
-              <w:spacing w:after="100"/>
-            </w:pPr>
-            <w:r>
-              <w:rPr>
-                <w:b/>
-                <w:bCs/>
-              </w:rPr>
-              <w:t xml:space="preserve">FR-14 — Annullamento da parte del passeggero</w:t>
-            </w:r>
-          </w:p>
-          <w:p>
-            <w:r>
-              <w:t xml:space="preserve">Il sistema consente al passeggero di annullare in qualunque momento una propria richiesta o prenotazione attiva, liberando il posto sulla corsa.</w:t>
-            </w:r>
-          </w:p>
-        </w:tc>
-      </w:tr>
-    </w:tbl>
-    <w:p>
-      <w:pPr>
-        <w:pStyle w:val="Heading3"/>
-        <w:spacing w:after="100" w:before="220"/>
-      </w:pPr>
-      <w:r>
-        <w:t xml:space="preserve">1.3.15. FR-15</w:t>
-      </w:r>
-    </w:p>
-    <w:tbl>
-      <w:tblPr>
-        <w:tblW w:type="pct" w:w="100%"/>
-        <w:tblBorders>
-          <w:top w:val="single" w:color="2f855a" w:sz="4"/>
-          <w:left w:val="single" w:color="2f855a" w:sz="4"/>
-          <w:bottom w:val="single" w:color="2f855a" w:sz="4"/>
-          <w:right w:val="single" w:color="2f855a" w:sz="4"/>
-          <w:insideH w:val="single" w:color="auto" w:sz="4"/>
-          <w:insideV w:val="single" w:color="auto" w:sz="4"/>
-        </w:tblBorders>
-      </w:tblPr>
-      <w:tblGrid>
-        <w:gridCol w:w="100"/>
-      </w:tblGrid>
-      <w:tr>
-        <w:tc>
-          <w:tcPr>
-            <w:shd w:fill="F0FBF3" w:val="clear"/>
-            <w:tcMar>
-              <w:top w:type="dxa" w:w="160"/>
-              <w:left w:type="dxa" w:w="200"/>
-              <w:bottom w:type="dxa" w:w="160"/>
-              <w:right w:type="dxa" w:w="200"/>
-            </w:tcMar>
-          </w:tcPr>
-          <w:p>
-            <w:pPr>
-              <w:spacing w:after="100"/>
-            </w:pPr>
-            <w:r>
-              <w:rPr>
-                <w:b/>
-                <w:bCs/>
-              </w:rPr>
-              <w:t xml:space="preserve">FR-15 — Completamento di un passaggio</w:t>
-            </w:r>
-          </w:p>
-          <w:p>
-            <w:r>
-              <w:t xml:space="preserve">Il sistema consente al guidatore di segnare come completato un proprio passaggio non ancora in uno stato terminale.</w:t>
-            </w:r>
-          </w:p>
-        </w:tc>
-      </w:tr>
-    </w:tbl>
-    <w:p>
-      <w:pPr>
-        <w:pStyle w:val="Heading3"/>
-        <w:spacing w:after="100" w:before="220"/>
-      </w:pPr>
-      <w:r>
-        <w:t xml:space="preserve">1.3.16. FR-16</w:t>
-      </w:r>
-    </w:p>
-    <w:tbl>
-      <w:tblPr>
-        <w:tblW w:type="pct" w:w="100%"/>
-        <w:tblBorders>
-          <w:top w:val="single" w:color="2f855a" w:sz="4"/>
-          <w:left w:val="single" w:color="2f855a" w:sz="4"/>
-          <w:bottom w:val="single" w:color="2f855a" w:sz="4"/>
-          <w:right w:val="single" w:color="2f855a" w:sz="4"/>
-          <w:insideH w:val="single" w:color="auto" w:sz="4"/>
-          <w:insideV w:val="single" w:color="auto" w:sz="4"/>
-        </w:tblBorders>
-      </w:tblPr>
-      <w:tblGrid>
-        <w:gridCol w:w="100"/>
-      </w:tblGrid>
-      <w:tr>
-        <w:tc>
-          <w:tcPr>
-            <w:shd w:fill="F0FBF3" w:val="clear"/>
-            <w:tcMar>
-              <w:top w:type="dxa" w:w="160"/>
-              <w:left w:type="dxa" w:w="200"/>
-              <w:bottom w:type="dxa" w:w="160"/>
-              <w:right w:type="dxa" w:w="200"/>
-            </w:tcMar>
-          </w:tcPr>
-          <w:p>
-            <w:pPr>
-              <w:spacing w:after="100"/>
-            </w:pPr>
-            <w:r>
-              <w:rPr>
-                <w:b/>
-                <w:bCs/>
-              </w:rPr>
-              <w:t xml:space="preserve">FR-16 — Annullamento di un passaggio</w:t>
-            </w:r>
-          </w:p>
-          <w:p>
-            <w:r>
-              <w:t xml:space="preserve">Il sistema consente al guidatore di annullare un proprio passaggio anche in presenza di passeggeri già prenotati, notificando questi ultimi tramite il Pattern Observer.</w:t>
-            </w:r>
-          </w:p>
-        </w:tc>
-      </w:tr>
-    </w:tbl>
+        <w:spacing w:after="120" w:before="240"/>
+      </w:pPr>
+      <w:r>
+        <w:rPr>
+          <w:b/>
+          <w:bCs/>
+          <w:i/>
+          <w:iCs/>
+        </w:rPr>
+        <w:t xml:space="preserve">Glossario:</w:t>
+      </w:r>
+    </w:p>
+    <w:p>
+      <w:pPr>
+        <w:spacing w:after="100"/>
+      </w:pPr>
+      <w:r>
+        <w:rPr>
+          <w:i/>
+          <w:iCs/>
+        </w:rPr>
+        <w:t xml:space="preserve">Passaggio (Ride)</w:t>
+      </w:r>
+      <w:r>
+        <w:t xml:space="preserve"> = Un tragitto offerto da uno studente guidatore, con partenza, destinazione, data, orario, posti disponibili e costo base.</w:t>
+      </w:r>
+    </w:p>
+    <w:p>
+      <w:pPr>
+        <w:spacing w:after="100"/>
+      </w:pPr>
+      <w:r>
+        <w:rPr>
+          <w:i/>
+          <w:iCs/>
+        </w:rPr>
+        <w:t xml:space="preserve">Richiesta di Prenotazione (Booking)</w:t>
+      </w:r>
+      <w:r>
+        <w:t xml:space="preserve"> = La richiesta di un passeggero di occupare un posto su un Passaggio: il posto viene riservato subito, ma resta in attesa di conferma del guidatore.</w:t>
+      </w:r>
+    </w:p>
+    <w:p>
+      <w:pPr>
+        <w:spacing w:after="100"/>
+      </w:pPr>
+      <w:r>
+        <w:rPr>
+          <w:i/>
+          <w:iCs/>
+        </w:rPr>
+        <w:t xml:space="preserve">Ateneo più vicino</w:t>
+      </w:r>
+      <w:r>
+        <w:t xml:space="preserve"> = Il campus universitario, tra quelli noti al sistema, geograficamente più vicino alla posizione dichiarata dallo studente; suggerito come destinazione predefinita in Offri/Cerca Passaggio.</w:t>
+      </w:r>
+    </w:p>
+    <w:p>
+      <w:pPr>
+        <w:spacing w:after="100"/>
+      </w:pPr>
+      <w:r>
+        <w:rPr>
+          <w:i/>
+          <w:iCs/>
+        </w:rPr>
+        <w:t xml:space="preserve">Stato del Passaggio</w:t>
+      </w:r>
+      <w:r>
+        <w:t xml:space="preserve"> = La fase del ciclo di vita di un Passaggio (AVAILABLE, FULL, COMPLETED, CANCELLED), governata dal Pattern State.</w:t>
+      </w:r>
+    </w:p>
+    <w:p>
+      <w:pPr>
+        <w:spacing w:after="100"/>
+      </w:pPr>
+      <w:r>
+        <w:rPr>
+          <w:i/>
+          <w:iCs/>
+        </w:rPr>
+        <w:t xml:space="preserve">Stato della Richiesta</w:t>
+      </w:r>
+      <w:r>
+        <w:t xml:space="preserve"> = La fase del ciclo di vita di una Richiesta di Prenotazione (REQUESTED, CONFIRMED, REJECTED, CANCELLED).</w:t>
+      </w:r>
+    </w:p>
     <w:p>
       <w:pPr>
         <w:pStyle w:val="Heading2"/>

</xml_diff>

<commit_message>
Documentazione: VOPC Class Diagram e pattern Observer/Strategy in bianco/nero (rif. SunBook)
Come già fatto per Activity/Sequence/State/Use Case Diagram, converte
allo stesso stile monocromatico anche le due figure rimaste colorate in
sezione 3.1-3.2:

- Figura 2 (Class Diagram combinato Boundary/Bean/Control/Entity):
  classi bianco/nero con solo bordo nero, fasce di livello con etichetta
  semplice senza sfondo colorato — stessa struttura/contenuto di prima,
  solo la resa cambia.
- Figura 8 (Observer + Strategy applicati a Ride e al calcolo dei
  costi): stessa conversione bianco/nero.

Il diagramma di overview a livello di package (Figura 7) resta colorato:
non ha un equivalente nel riferimento del corso ed è a un livello di
astrazione diverso (package, non classi).

Nessun impatto su pagine o numeri dell'indice.
</commit_message>
<xml_diff>
--- a/docs/UniRide_Submission.docx
+++ b/docs/UniRide_Submission.docx
@@ -1952,7 +1952,7 @@
       <w:r>
         <w:drawing>
           <wp:inline distT="0" distB="0" distL="0" distR="0">
-            <wp:extent cx="5715000" cy="3826565"/>
+            <wp:extent cx="5715000" cy="3922643"/>
             <wp:effectExtent t="0" r="0" b="0" l="0"/>
             <wp:docPr id="1" name="" descr="" title=""/>
             <wp:cNvGraphicFramePr>
@@ -1977,7 +1977,7 @@
                   <pic:spPr bwMode="auto">
                     <a:xfrm>
                       <a:off x="0" y="0"/>
-                      <a:ext cx="5715000" cy="3826565"/>
+                      <a:ext cx="5715000" cy="3922643"/>
                     </a:xfrm>
                     <a:prstGeom prst="rect">
                       <a:avLst/>
@@ -2453,7 +2453,7 @@
       <w:r>
         <w:drawing>
           <wp:inline distT="0" distB="0" distL="0" distR="0">
-            <wp:extent cx="5334000" cy="5057775"/>
+            <wp:extent cx="5334000" cy="5334000"/>
             <wp:effectExtent t="0" r="0" b="0" l="0"/>
             <wp:docPr id="1" name="" descr="" title=""/>
             <wp:cNvGraphicFramePr>
@@ -2478,7 +2478,7 @@
                   <pic:spPr bwMode="auto">
                     <a:xfrm>
                       <a:off x="0" y="0"/>
-                      <a:ext cx="5334000" cy="5057775"/>
+                      <a:ext cx="5334000" cy="5334000"/>
                     </a:xfrm>
                     <a:prstGeom prst="rect">
                       <a:avLst/>

</xml_diff>

<commit_message>
Documentazione: traduzione completa in inglese, colore nei diagrammi, VOPC ad alta risoluzione
- Tutti i diagrammi (Use Case, VOPC, Pattern, Activity, Sequence, State x2)
  ricolorati (palette Boundary/Bean/Control/Entity coerente con la Fig. 7)
  e rigenerati a risoluzione piu' alta (scale 4) per eliminare la sgranatura
  segnalata sul diagramma VOPC/BCE
- Prosa, tabelle, User Story, FR, Glossario, Storyboard, Design Pattern,
  Testing, Exceptions, Databases e SonarCloud tradotti in inglese in
  entrambi i docx (Submission e Technical Documentation)
- I messaggi applicativi letterali (errori mostrati realmente dalla UI,
  in italiano) restano citati in italiano tra virgolette con glossa
  inglese a fianco, coerentemente con la lingua reale dell'interfaccia
- Numeri di pagina nell'indice ricalcolati dopo il reflow dovuto alla
  traduzione (FR piu' corti, Activity Diagram piu' alto)
</commit_message>
<xml_diff>
--- a/docs/UniRide_Submission.docx
+++ b/docs/UniRide_Submission.docx
@@ -66,7 +66,7 @@
           <w:sz w:val="24"/>
           <w:szCs w:val="24"/>
         </w:rPr>
-        <w:t xml:space="preserve">Ingegneria del Software</w:t>
+        <w:t xml:space="preserve">Software Engineering</w:t>
       </w:r>
     </w:p>
     <w:p>
@@ -138,7 +138,7 @@
       <w:r>
         <w:t xml:space="preserve">1.3. Functional Requirements</w:t>
         <w:ptab w:alignment="right" w:relativeTo="margin" w:leader="dot"/>
-        <w:t xml:space="preserve">5</w:t>
+        <w:t xml:space="preserve">4</w:t>
       </w:r>
     </w:p>
     <w:p>
@@ -226,7 +226,7 @@
       <w:r>
         <w:t xml:space="preserve">3.5. Sequence Diagram</w:t>
         <w:ptab w:alignment="right" w:relativeTo="margin" w:leader="dot"/>
-        <w:t xml:space="preserve">15</w:t>
+        <w:t xml:space="preserve">16</w:t>
       </w:r>
     </w:p>
     <w:p>
@@ -248,7 +248,7 @@
       <w:r>
         <w:t xml:space="preserve">4. TESTING</w:t>
         <w:ptab w:alignment="right" w:relativeTo="margin" w:leader="dot"/>
-        <w:t xml:space="preserve">18</w:t>
+        <w:t xml:space="preserve">17</w:t>
       </w:r>
     </w:p>
     <w:p>
@@ -274,7 +274,7 @@
           <w:sz w:val="18"/>
           <w:szCs w:val="18"/>
         </w:rPr>
-        <w:t xml:space="preserve">I numeri di pagina sono riferiti all'esportazione PDF del documento; potrebbero variare leggermente aprendo il file in Word in base ai font disponibili sul sistema.</w:t>
+        <w:t xml:space="preserve">Page numbers refer to the PDF export of this document; they may vary slightly when opening the file in Word, depending on the fonts available on the system.</w:t>
       </w:r>
     </w:p>
     <w:p>
@@ -324,7 +324,7 @@
         <w:spacing w:after="160"/>
       </w:pPr>
       <w:r>
-        <w:t xml:space="preserve">Il presente documento ha lo scopo di presentare in modo oggettivo i requisiti fondamentali e specifici del sistema UniRide. Attraverso descrizioni testuali, user story, diagrammi dei casi d'uso e artefatti di design, vengono ripercorsi tutti gli aspetti interni ed esterni rilevanti del sistema, fungendo da riferimento autorevole per lo sviluppo, il testing e la valutazione.</w:t>
+        <w:t xml:space="preserve">This document aims to objectively present the fundamental and specific requirements of the UniRide system. Through textual descriptions, user stories, use case diagrams and design artifacts, all relevant internal and external aspects of the system are covered, serving as an authoritative reference for development, testing and evaluation.</w:t>
       </w:r>
     </w:p>
     <w:p>
@@ -341,15 +341,15 @@
         <w:spacing w:after="160"/>
       </w:pPr>
       <w:r>
-        <w:t xml:space="preserve">Il sistema qui esposto è un'applicazione desktop che aiuta gli studenti universitari a organizzare passaggi in auto condivisi da e per il campus. L'obiettivo primario è ridurre i costi di viaggio, le emissioni di CO₂ e favorire la socializzazione fra studenti dello stesso ateneo.</w:t>
-      </w:r>
-    </w:p>
-    <w:p>
-      <w:pPr>
-        <w:spacing w:after="160"/>
-      </w:pPr>
-      <w:r>
-        <w:t xml:space="preserve">Sono supportati due ruoli dal sistema:</w:t>
+        <w:t xml:space="preserve">The system described here is a desktop application that helps university students organize shared car rides to and from campus. The primary goal is to reduce travel costs and CO₂ emissions, and to foster socialization among students of the same university.</w:t>
+      </w:r>
+    </w:p>
+    <w:p>
+      <w:pPr>
+        <w:spacing w:after="160"/>
+      </w:pPr>
+      <w:r>
+        <w:t xml:space="preserve">The system supports two roles:</w:t>
       </w:r>
     </w:p>
     <w:p>
@@ -362,7 +362,7 @@
         <w:spacing w:after="80"/>
       </w:pPr>
       <w:r>
-        <w:t xml:space="preserve">Guidatore (Studente) — pubblica un nuovo passaggio specificando partenza, destinazione, data, posti disponibili e costo base stimato. Le richieste di prenotazione in arrivo vengono confermate o rifiutate esplicitamente dal guidatore stesso; la corsa può inoltre essere segnata come completata o annullata in qualsiasi momento.</w:t>
+        <w:t xml:space="preserve">Driver (Student) — publishes a new ride specifying departure, destination, date, available seats and an estimated base cost. Incoming booking requests are explicitly confirmed or rejected by the driver; the ride can also be marked as completed or cancelled at any time.</w:t>
       </w:r>
     </w:p>
     <w:p>
@@ -375,15 +375,15 @@
         <w:spacing w:after="80"/>
       </w:pPr>
       <w:r>
-        <w:t xml:space="preserve">Passeggero (Studente) — consulta i passaggi disponibili, filtrandoli per partenza e destinazione, e richiede un posto. Il posto viene riservato immediatamente per evitare overbooking, ma la richiesta resta in attesa finché il guidatore non la conferma o la rifiuta. Il passeggero può annullare una richiesta o una prenotazione già confermata in qualsiasi momento, liberando automaticamente il posto.</w:t>
-      </w:r>
-    </w:p>
-    <w:p>
-      <w:pPr>
-        <w:spacing w:after="160"/>
-      </w:pPr>
-      <w:r>
-        <w:t xml:space="preserve">Il sistema gestisce il ciclo di vita completo di un Ride (AVAILABLE, FULL, COMPLETED, CANCELLED, tramite il Pattern State) e di una Booking (REQUESTED, CONFIRMED, REJECTED, CANCELLED), notificando i passeggeri coinvolti ad ogni transizione rilevante tramite il Pattern Observer.</w:t>
+        <w:t xml:space="preserve">Passenger (Student) — browses available rides, filtering by departure and destination, and requests a seat. The seat is reserved immediately to prevent overbooking, but the request remains pending until the driver confirms or rejects it. The passenger can cancel a request or an already-confirmed booking at any time, automatically freeing the seat.</w:t>
+      </w:r>
+    </w:p>
+    <w:p>
+      <w:pPr>
+        <w:spacing w:after="160"/>
+      </w:pPr>
+      <w:r>
+        <w:t xml:space="preserve">The system manages the complete lifecycle of a Ride (AVAILABLE, FULL, COMPLETED, CANCELLED, via the State Pattern) and of a Booking (REQUESTED, CONFIRMED, REJECTED, CANCELLED), notifying the involved passengers at every relevant transition via the Observer Pattern.</w:t>
       </w:r>
     </w:p>
     <w:p>
@@ -400,15 +400,15 @@
         <w:spacing w:after="160"/>
       </w:pPr>
       <w:r>
-        <w:t xml:space="preserve">Il requisito hardware di base è un computer in grado di eseguire una Java Virtual Machine, oltre a un minimo spazio su disco per i file CSV quando è attiva la modalità di persistenza su file system.</w:t>
-      </w:r>
-    </w:p>
-    <w:p>
-      <w:pPr>
-        <w:spacing w:after="160"/>
-      </w:pPr>
-      <w:r>
-        <w:t xml:space="preserve">I requisiti software sono i seguenti:</w:t>
+        <w:t xml:space="preserve">The basic hardware requirement is a computer capable of running a Java Virtual Machine, plus a small amount of disk space for CSV files when the file-system persistence mode is active.</w:t>
+      </w:r>
+    </w:p>
+    <w:p>
+      <w:pPr>
+        <w:spacing w:after="160"/>
+      </w:pPr>
+      <w:r>
+        <w:t xml:space="preserve">The software requirements are as follows:</w:t>
       </w:r>
     </w:p>
     <w:tbl>
@@ -520,7 +520,7 @@
                 <w:sz w:val="20"/>
                 <w:szCs w:val="20"/>
               </w:rPr>
-              <w:t xml:space="preserve">Java 25 o superiore (OpenJDK o Oracle JDK)</w:t>
+              <w:t xml:space="preserve">Java 25 or later (OpenJDK or Oracle JDK)</w:t>
             </w:r>
           </w:p>
         </w:tc>
@@ -568,7 +568,7 @@
                 <w:sz w:val="20"/>
                 <w:szCs w:val="20"/>
               </w:rPr>
-              <w:t xml:space="preserve">Apache Maven 3.8 o superiore</w:t>
+              <w:t xml:space="preserve">Apache Maven 3.8 or later</w:t>
             </w:r>
           </w:p>
         </w:tc>
@@ -616,7 +616,7 @@
                 <w:sz w:val="20"/>
                 <w:szCs w:val="20"/>
               </w:rPr>
-              <w:t xml:space="preserve">JavaFX 21.0.5 (risolto automaticamente da Maven)</w:t>
+              <w:t xml:space="preserve">JavaFX 21.0.5 (automatically resolved by Maven)</w:t>
             </w:r>
           </w:p>
         </w:tc>
@@ -641,7 +641,7 @@
                 <w:sz w:val="20"/>
                 <w:szCs w:val="20"/>
               </w:rPr>
-              <w:t xml:space="preserve">Sistema Operativo</w:t>
+              <w:t xml:space="preserve">Operating System</w:t>
             </w:r>
           </w:p>
         </w:tc>
@@ -664,7 +664,7 @@
                 <w:sz w:val="20"/>
                 <w:szCs w:val="20"/>
               </w:rPr>
-              <w:t xml:space="preserve">macOS, Windows 10+, o Linux (Ubuntu 20+)</w:t>
+              <w:t xml:space="preserve">macOS, Windows 10+, or Linux (Ubuntu 20+)</w:t>
             </w:r>
           </w:p>
         </w:tc>
@@ -712,7 +712,7 @@
                 <w:sz w:val="20"/>
                 <w:szCs w:val="20"/>
               </w:rPr>
-              <w:t xml:space="preserve">Minimo 512 MB liberi</w:t>
+              <w:t xml:space="preserve">Minimum 512 MB free</w:t>
             </w:r>
           </w:p>
         </w:tc>
@@ -737,7 +737,7 @@
                 <w:sz w:val="20"/>
                 <w:szCs w:val="20"/>
               </w:rPr>
-              <w:t xml:space="preserve">Spazio Disco</w:t>
+              <w:t xml:space="preserve">Disk Space</w:t>
             </w:r>
           </w:p>
         </w:tc>
@@ -760,7 +760,7 @@
                 <w:sz w:val="20"/>
                 <w:szCs w:val="20"/>
               </w:rPr>
-              <w:t xml:space="preserve">Circa 50 MB (JAR più eventuali file CSV)</w:t>
+              <w:t xml:space="preserve">About 50 MB (JAR plus any CSV files)</w:t>
             </w:r>
           </w:p>
         </w:tc>
@@ -785,7 +785,7 @@
                 <w:sz w:val="20"/>
                 <w:szCs w:val="20"/>
               </w:rPr>
-              <w:t xml:space="preserve">Persistenza</w:t>
+              <w:t xml:space="preserve">Persistence</w:t>
             </w:r>
           </w:p>
         </w:tc>
@@ -808,7 +808,7 @@
                 <w:sz w:val="20"/>
                 <w:szCs w:val="20"/>
               </w:rPr>
-              <w:t xml:space="preserve">In-Memory (default) o file system CSV, selezionabile in Config.PERSISTENCE_TYPE</w:t>
+              <w:t xml:space="preserve">In-Memory (default) or CSV file system, selectable in Config.PERSISTENCE_TYPE</w:t>
             </w:r>
           </w:p>
         </w:tc>
@@ -840,7 +840,7 @@
         <w:spacing w:after="160"/>
       </w:pPr>
       <w:r>
-        <w:t xml:space="preserve">BlaBlaCar è il principale marketplace europeo di carpooling, che connette milioni di guidatori e passeggeri per viaggi tra città. Tra i pro: una base utenti molto ampia, un sistema di pagamento integrato e profili guidatore verificati. Tra i contro: non è pensato per studenti o tratte universitarie, richiede una transazione economica per ogni prenotazione e non ha alcun concetto di campus universitario come punto di riferimento.</w:t>
+        <w:t xml:space="preserve">BlaBlaCar is the leading European carpooling marketplace, connecting millions of drivers and passengers for intercity trips. Pros: a very large user base, an integrated payment system, and verified driver profiles. Cons: it is not designed for students or university routes, it requires a financial transaction for every booking, and it has no concept of a university campus as a reference point.</w:t>
       </w:r>
     </w:p>
     <w:p>
@@ -860,7 +860,7 @@
         <w:spacing w:after="160"/>
       </w:pPr>
       <w:r>
-        <w:t xml:space="preserve">GoMore è una piattaforma scandinava di ride-sharing che supporta anche il noleggio auto tra privati. A favore ha offerte di passaggio flessibili e un'interfaccia mobile pulita e moderna. Tuttavia manca di funzionalità legate alla community accademica (nessun filtro per università, nessuna verifica studentesca), impone un modello ad abbonamento ai guidatori e non offre una modalità demo offline o in memoria, rendendola poco adatta come riferimento per un'applicazione desktop Java in stile BCE.</w:t>
+        <w:t xml:space="preserve">GoMore is a Scandinavian ride-sharing platform that also supports peer-to-peer car rental. In its favor, it offers flexible ride listings and a clean, modern mobile interface. However, it lacks features tied to an academic community (no university filter, no student verification), imposes a subscription model on drivers, and offers no offline or in-memory demo mode, making it a poor reference for a BCE-style Java desktop application.</w:t>
       </w:r>
     </w:p>
     <w:p>
@@ -921,7 +921,7 @@
           </w:p>
           <w:p>
             <w:r>
-              <w:t xml:space="preserve">Come Studente, voglio pubblicare l'offerta di un passaggio specificando partenza, destinazione, data, posti disponibili e costo totale, così che altri studenti possano trovarlo e richiedere un posto nella mia auto.</w:t>
+              <w:t xml:space="preserve">As a Student, I want to publish a ride offer specifying departure, destination, date, available seats and total cost, so that other students can find it and request a seat in my car.</w:t>
             </w:r>
           </w:p>
         </w:tc>
@@ -976,7 +976,7 @@
           </w:p>
           <w:p>
             <w:r>
-              <w:t xml:space="preserve">Come Studente, voglio cercare i passaggi disponibili filtrando per partenza e destinazione, così da trovare rapidamente un passaggio adatto senza scorrere offerte irrilevanti.</w:t>
+              <w:t xml:space="preserve">As a Student, I want to search for available rides by filtering on departure and destination, so I can quickly find a suitable ride without scrolling through irrelevant offers.</w:t>
             </w:r>
           </w:p>
         </w:tc>
@@ -1031,7 +1031,7 @@
           </w:p>
           <w:p>
             <w:r>
-              <w:t xml:space="preserve">Come Studente, voglio richiedere un posto su un passaggio ed essere avvisato quando il guidatore lo conferma o lo rifiuta, così da sapere sempre lo stato reale della mia prenotazione.</w:t>
+              <w:t xml:space="preserve">As a Student, I want to request a seat on a ride and be notified when the driver confirms or rejects it, so I always know the real status of my booking.</w:t>
             </w:r>
           </w:p>
         </w:tc>
@@ -1086,7 +1086,7 @@
           </w:p>
           <w:p>
             <w:r>
-              <w:t xml:space="preserve">Come Studente guidatore, voglio poter confermare o rifiutare le richieste di prenotazione ricevute, segnare una corsa come completata o annullarla anche con passeggeri già a bordo, così da avere pieno controllo sul mio passaggio.</w:t>
+              <w:t xml:space="preserve">As a Student driver, I want to be able to confirm or reject incoming booking requests, mark a ride as completed, or cancel it even with passengers already on board, so I have full control over my ride.</w:t>
             </w:r>
           </w:p>
         </w:tc>
@@ -1145,12 +1145,12 @@
                 <w:b/>
                 <w:bCs/>
               </w:rPr>
-              <w:t xml:space="preserve">FR-1 — Autenticazione</w:t>
-            </w:r>
-          </w:p>
-          <w:p>
-            <w:r>
-              <w:t xml:space="preserve">Il sistema consente a uno studente di registrarsi con username, password e dati anagrafici, e di accedere con le proprie credenziali.</w:t>
+              <w:t xml:space="preserve">FR-1 — Authentication</w:t>
+            </w:r>
+          </w:p>
+          <w:p>
+            <w:r>
+              <w:t xml:space="preserve">The system shall allow a student to register with a username, password and personal details, and to log in with their credentials.</w:t>
             </w:r>
           </w:p>
         </w:tc>
@@ -1200,12 +1200,12 @@
                 <w:b/>
                 <w:bCs/>
               </w:rPr>
-              <w:t xml:space="preserve">FR-2 — Gestione Passaggio</w:t>
-            </w:r>
-          </w:p>
-          <w:p>
-            <w:r>
-              <w:t xml:space="preserve">Il sistema consente a un guidatore autenticato di pubblicare, completare o annullare un proprio passaggio.</w:t>
+              <w:t xml:space="preserve">FR-2 — Ride Management</w:t>
+            </w:r>
+          </w:p>
+          <w:p>
+            <w:r>
+              <w:t xml:space="preserve">The system shall allow an authenticated driver to publish, complete or cancel their own ride.</w:t>
             </w:r>
           </w:p>
         </w:tc>
@@ -1255,12 +1255,12 @@
                 <w:b/>
                 <w:bCs/>
               </w:rPr>
-              <w:t xml:space="preserve">FR-3 — Prenotazione</w:t>
-            </w:r>
-          </w:p>
-          <w:p>
-            <w:r>
-              <w:t xml:space="preserve">Il sistema consente a un passeggero autenticato di cercare un passaggio disponibile e richiedere un posto, riservato immediatamente.</w:t>
+              <w:t xml:space="preserve">FR-3 — Booking</w:t>
+            </w:r>
+          </w:p>
+          <w:p>
+            <w:r>
+              <w:t xml:space="preserve">The system shall allow an authenticated passenger to search for an available ride and request a seat, which is reserved immediately.</w:t>
             </w:r>
           </w:p>
         </w:tc>
@@ -1310,12 +1310,12 @@
                 <w:b/>
                 <w:bCs/>
               </w:rPr>
-              <w:t xml:space="preserve">FR-4 — Gestione delle Richieste</w:t>
-            </w:r>
-          </w:p>
-          <w:p>
-            <w:r>
-              <w:t xml:space="preserve">Il sistema consente al guidatore di confermare o rifiutare una richiesta di prenotazione, e a entrambe le parti di annullarla in qualunque momento.</w:t>
+              <w:t xml:space="preserve">FR-4 — Request Management</w:t>
+            </w:r>
+          </w:p>
+          <w:p>
+            <w:r>
+              <w:t xml:space="preserve">The system shall allow the driver to confirm or reject a booking request, and both parties to cancel it at any time.</w:t>
             </w:r>
           </w:p>
         </w:tc>
@@ -1332,7 +1332,7 @@
           <w:i/>
           <w:iCs/>
         </w:rPr>
-        <w:t xml:space="preserve">Glossario:</w:t>
+        <w:t xml:space="preserve">Glossary:</w:t>
       </w:r>
     </w:p>
     <w:p>
@@ -1344,10 +1344,10 @@
           <w:i/>
           <w:iCs/>
         </w:rPr>
-        <w:t xml:space="preserve">Passaggio (Ride)</w:t>
-      </w:r>
-      <w:r>
-        <w:t xml:space="preserve"> = Un tragitto offerto da uno studente guidatore, con partenza, destinazione, data, orario, posti disponibili e costo base.</w:t>
+        <w:t xml:space="preserve">Ride</w:t>
+      </w:r>
+      <w:r>
+        <w:t xml:space="preserve"> = A trip offered by a student driver, with departure, destination, date, time, available seats and base cost.</w:t>
       </w:r>
     </w:p>
     <w:p>
@@ -1359,10 +1359,10 @@
           <w:i/>
           <w:iCs/>
         </w:rPr>
-        <w:t xml:space="preserve">Richiesta di Prenotazione (Booking)</w:t>
-      </w:r>
-      <w:r>
-        <w:t xml:space="preserve"> = La richiesta di un passeggero di occupare un posto su un Passaggio: il posto viene riservato subito, ma resta in attesa di conferma del guidatore.</w:t>
+        <w:t xml:space="preserve">Booking</w:t>
+      </w:r>
+      <w:r>
+        <w:t xml:space="preserve"> = A passenger's request to occupy a seat on a Ride: the seat is reserved immediately, but remains pending the driver's confirmation.</w:t>
       </w:r>
     </w:p>
     <w:p>
@@ -1374,10 +1374,10 @@
           <w:i/>
           <w:iCs/>
         </w:rPr>
-        <w:t xml:space="preserve">Ateneo più vicino</w:t>
-      </w:r>
-      <w:r>
-        <w:t xml:space="preserve"> = Il campus universitario, tra quelli noti al sistema, geograficamente più vicino alla posizione dichiarata dallo studente; suggerito come destinazione predefinita in Offri/Cerca Passaggio.</w:t>
+        <w:t xml:space="preserve">Nearest University</w:t>
+      </w:r>
+      <w:r>
+        <w:t xml:space="preserve"> = The university campus, among those known to the system, geographically closest to the student's declared location; suggested as the default destination in Offer/Search Ride.</w:t>
       </w:r>
     </w:p>
     <w:p>
@@ -1389,10 +1389,10 @@
           <w:i/>
           <w:iCs/>
         </w:rPr>
-        <w:t xml:space="preserve">Stato del Passaggio</w:t>
-      </w:r>
-      <w:r>
-        <w:t xml:space="preserve"> = La fase del ciclo di vita di un Passaggio (AVAILABLE, FULL, COMPLETED, CANCELLED), governata dal Pattern State.</w:t>
+        <w:t xml:space="preserve">Ride State</w:t>
+      </w:r>
+      <w:r>
+        <w:t xml:space="preserve"> = The lifecycle phase of a Ride (AVAILABLE, FULL, COMPLETED, CANCELLED), governed by the State Pattern.</w:t>
       </w:r>
     </w:p>
     <w:p>
@@ -1404,10 +1404,10 @@
           <w:i/>
           <w:iCs/>
         </w:rPr>
-        <w:t xml:space="preserve">Stato della Richiesta</w:t>
-      </w:r>
-      <w:r>
-        <w:t xml:space="preserve"> = La fase del ciclo di vita di una Richiesta di Prenotazione (REQUESTED, CONFIRMED, REJECTED, CANCELLED).</w:t>
+        <w:t xml:space="preserve">Booking State</w:t>
+      </w:r>
+      <w:r>
+        <w:t xml:space="preserve"> = The lifecycle phase of a Booking (REQUESTED, CONFIRMED, REJECTED, CANCELLED).</w:t>
       </w:r>
     </w:p>
     <w:p>
@@ -1436,7 +1436,7 @@
       <w:r>
         <w:drawing>
           <wp:inline distT="0" distB="0" distL="0" distR="0">
-            <wp:extent cx="5715000" cy="4506058"/>
+            <wp:extent cx="5715000" cy="4497705"/>
             <wp:effectExtent t="0" r="0" b="0" l="0"/>
             <wp:docPr id="1" name="" descr="" title=""/>
             <wp:cNvGraphicFramePr>
@@ -1461,7 +1461,7 @@
                   <pic:spPr bwMode="auto">
                     <a:xfrm>
                       <a:off x="0" y="0"/>
-                      <a:ext cx="5715000" cy="4506058"/>
+                      <a:ext cx="5715000" cy="4497705"/>
                     </a:xfrm>
                     <a:prstGeom prst="rect">
                       <a:avLst/>
@@ -1487,7 +1487,7 @@
           <w:sz w:val="20"/>
           <w:szCs w:val="20"/>
         </w:rPr>
-        <w:t xml:space="preserve">Figura 1 — Diagramma dei casi d'uso, attore Studente</w:t>
+        <w:t xml:space="preserve">Figure 1 — Use case diagram, Student actor</w:t>
       </w:r>
     </w:p>
     <w:p>
@@ -1508,7 +1508,7 @@
           <w:b/>
           <w:bCs/>
         </w:rPr>
-        <w:t xml:space="preserve">Nome: Offri un nuovo passaggio</w:t>
+        <w:t xml:space="preserve">Name: Offer a new ride</w:t>
       </w:r>
     </w:p>
     <w:p>
@@ -1521,7 +1521,7 @@
         <w:spacing w:after="80"/>
       </w:pPr>
       <w:r>
-        <w:t xml:space="preserve">1) Il guidatore apre la schermata 'Offri un Passaggio' dalla Dashboard.</w:t>
+        <w:t xml:space="preserve">1) The driver opens the 'Offri un Passaggio' screen from the Dashboard.</w:t>
       </w:r>
     </w:p>
     <w:p>
@@ -1534,7 +1534,7 @@
         <w:spacing w:after="80"/>
       </w:pPr>
       <w:r>
-        <w:t xml:space="preserve">2) Il guidatore seleziona partenza e destinazione da un menu a tendina di località (editabile per cercare liberamente), una data dal calendario, un orario di partenza (formato HH:mm), i posti disponibili con un contatore numerico e il costo base.</w:t>
+        <w:t xml:space="preserve">2) The driver selects departure and destination from a location dropdown (editable for free-text search), a date from the calendar, a departure time (HH:mm format), the available seats with a numeric counter, and the base cost.</w:t>
       </w:r>
     </w:p>
     <w:p>
@@ -1547,7 +1547,7 @@
         <w:spacing w:after="80"/>
       </w:pPr>
       <w:r>
-        <w:t xml:space="preserve">3) Il sistema valida i campi obbligatori, verifica che partenza e destinazione non coincidano, che il numero di posti sia maggiore di zero e che l'orario di partenza rispetti il formato HH:mm.</w:t>
+        <w:t xml:space="preserve">3) The system validates the mandatory fields, checks that departure and destination do not coincide, that the number of seats is greater than zero, and that the departure time matches the HH:mm format.</w:t>
       </w:r>
     </w:p>
     <w:p>
@@ -1560,7 +1560,7 @@
         <w:spacing w:after="80"/>
       </w:pPr>
       <w:r>
-        <w:t xml:space="preserve">4) Il sistema crea l'entità Ride generando un UUID interno e impostando lo stato iniziale AVAILABLE, quindi la persiste tramite il RideDAO ottenuto dalla DAOFactory.</w:t>
+        <w:t xml:space="preserve">4) The system creates the Ride entity, generating an internal UUID and setting the initial state to AVAILABLE, then persists it through the RideDAO obtained from the DAOFactory.</w:t>
       </w:r>
     </w:p>
     <w:p>
@@ -1573,15 +1573,15 @@
         <w:spacing w:after="80"/>
       </w:pPr>
       <w:r>
-        <w:t xml:space="preserve">5) Il sistema mostra un messaggio di conferma e svuota il form.</w:t>
-      </w:r>
-    </w:p>
-    <w:p>
-      <w:pPr>
-        <w:spacing w:after="160"/>
-      </w:pPr>
-      <w:r>
-        <w:t xml:space="preserve">Estensioni:</w:t>
+        <w:t xml:space="preserve">5) The system shows a confirmation message and clears the form.</w:t>
+      </w:r>
+    </w:p>
+    <w:p>
+      <w:pPr>
+        <w:spacing w:after="160"/>
+      </w:pPr>
+      <w:r>
+        <w:t xml:space="preserve">Extensions:</w:t>
       </w:r>
     </w:p>
     <w:p>
@@ -1594,7 +1594,7 @@
         <w:spacing w:after="80"/>
       </w:pPr>
       <w:r>
-        <w:t xml:space="preserve">3a. Un campo obbligatorio è vuoto, oppure partenza e destinazione coincidono: il sistema mostra un errore inline e resta sulla stessa schermata senza persistere nulla.</w:t>
+        <w:t xml:space="preserve">3a. A required field is empty, or departure and destination coincide: the system shows an inline error and stays on the same screen without persisting anything.</w:t>
       </w:r>
     </w:p>
     <w:p>
@@ -1607,7 +1607,7 @@
         <w:spacing w:after="80"/>
       </w:pPr>
       <w:r>
-        <w:t xml:space="preserve">3b. Il numero di posti non è maggiore di zero: il sistema rifiuta l'input con il messaggio 'Il numero di posti deve essere maggiore di zero.'</w:t>
+        <w:t xml:space="preserve">3b. The number of seats is not greater than zero: the system rejects the input with the message 'Il numero di posti deve essere maggiore di zero.'</w:t>
       </w:r>
     </w:p>
     <w:p>
@@ -1620,7 +1620,7 @@
         <w:spacing w:after="80"/>
       </w:pPr>
       <w:r>
-        <w:t xml:space="preserve">3c. Il costo inserito è negativo: il sistema rifiuta l'input con il messaggio 'Il costo base non può essere negativo.'</w:t>
+        <w:t xml:space="preserve">3c. The entered cost is negative: the system rejects the input with the message 'Il costo base non può essere negativo.'</w:t>
       </w:r>
     </w:p>
     <w:p>
@@ -1633,7 +1633,7 @@
         <w:spacing w:after="80"/>
       </w:pPr>
       <w:r>
-        <w:t xml:space="preserve">3d. L'orario di partenza è assente o non rispetta il formato HH:mm: il sistema rifiuta l'input con il messaggio 'Inserisci un orario di partenza valido (formato HH:mm, es. 08:30).'</w:t>
+        <w:t xml:space="preserve">3d. The departure time is missing or does not match the HH:mm format: the system rejects the input with the message 'Inserisci un orario di partenza valido (formato HH:mm, es. 08:30).'</w:t>
       </w:r>
     </w:p>
     <w:p>
@@ -1653,7 +1653,7 @@
           <w:b/>
           <w:bCs/>
         </w:rPr>
-        <w:t xml:space="preserve">Nome: Richiedi una prenotazione</w:t>
+        <w:t xml:space="preserve">Name: Request a booking</w:t>
       </w:r>
     </w:p>
     <w:p>
@@ -1666,7 +1666,7 @@
         <w:spacing w:after="80"/>
       </w:pPr>
       <w:r>
-        <w:t xml:space="preserve">1) Il passeggero cerca i passaggi disponibili per una tratta e ne seleziona uno dai risultati.</w:t>
+        <w:t xml:space="preserve">1) The passenger searches for available rides on a route and selects one from the results.</w:t>
       </w:r>
     </w:p>
     <w:p>
@@ -1679,7 +1679,7 @@
         <w:spacing w:after="80"/>
       </w:pPr>
       <w:r>
-        <w:t xml:space="preserve">2) Il sistema verifica che il richiedente non sia il guidatore del passaggio e che non abbia già una richiesta attiva sulla stessa corsa.</w:t>
+        <w:t xml:space="preserve">2) The system checks that the requester is not the ride's driver and does not already have an active request on the same ride.</w:t>
       </w:r>
     </w:p>
     <w:p>
@@ -1692,7 +1692,7 @@
         <w:spacing w:after="80"/>
       </w:pPr>
       <w:r>
-        <w:t xml:space="preserve">3) Il sistema riserva immediatamente il posto sul Ride (Pattern State) per evitare overbooking durante l'attesa.</w:t>
+        <w:t xml:space="preserve">3) The system immediately reserves the seat on the Ride (State Pattern) to prevent overbooking while the request is pending.</w:t>
       </w:r>
     </w:p>
     <w:p>
@@ -1705,7 +1705,7 @@
         <w:spacing w:after="80"/>
       </w:pPr>
       <w:r>
-        <w:t xml:space="preserve">4) Il sistema crea un Booking in stato REQUESTED e lo persiste tramite il BookingDAO.</w:t>
+        <w:t xml:space="preserve">4) The system creates a Booking in the REQUESTED state and persists it through the BookingDAO.</w:t>
       </w:r>
     </w:p>
     <w:p>
@@ -1718,7 +1718,7 @@
         <w:spacing w:after="80"/>
       </w:pPr>
       <w:r>
-        <w:t xml:space="preserve">5) Il guidatore, dalla propria dashboard, vede la richiesta pendente e la conferma o la rifiuta: se rifiutata, il posto riservato viene liberato.</w:t>
+        <w:t xml:space="preserve">5) The driver, from their own dashboard, sees the pending request and confirms or rejects it: if rejected, the reserved seat is freed.</w:t>
       </w:r>
     </w:p>
     <w:p>
@@ -1735,7 +1735,7 @@
         <w:spacing w:after="160"/>
       </w:pPr>
       <w:r>
-        <w:t xml:space="preserve">Il primo Storyboard è la schermata di autenticazione, dove lo studente accede con le proprie credenziali o naviga verso il form di registrazione per creare un nuovo account.</w:t>
+        <w:t xml:space="preserve">The first Storyboard is the authentication screen, where the student logs in with their credentials or navigates to the registration form to create a new account.</w:t>
       </w:r>
     </w:p>
     <w:p>
@@ -1747,7 +1747,7 @@
           <w:i/>
           <w:iCs/>
         </w:rPr>
-        <w:t xml:space="preserve">Storyboard 1 — Login e Registrazione</w:t>
+        <w:t xml:space="preserve">Storyboard 1 — Login and Registration</w:t>
       </w:r>
     </w:p>
     <w:p>
@@ -1809,23 +1809,23 @@
           <w:sz w:val="20"/>
           <w:szCs w:val="20"/>
         </w:rPr>
-        <w:t xml:space="preserve">Mockup 1 — Storyboard Login e Registrazione (LoginBoundary / RegisterBoundary)</w:t>
-      </w:r>
-    </w:p>
-    <w:p>
-      <w:pPr>
-        <w:spacing w:after="160"/>
-      </w:pPr>
-      <w:r>
-        <w:t xml:space="preserve">La schermata di login utilizza il design system moderno introdotto nel progetto: sfondo chiaro con card centrale arrotondata e ombreggiata, palette indaco/violetto (#4f46e5 → #6366f1) coerente su tutta l'applicazione. Due campi raccolgono username e password. Un'etichetta di errore, inizialmente vuota, appare in rosso sotto i campi quando le credenziali vengono rifiutate dal LoginController. Un bottone secondario porta al form di registrazione, dove nome e cognome, username, password e — facoltativamente — il comune/paese di residenza (selezionabile da un menu a tendina di località) vengono raccolti e validati prima che un'entità Student venga persistita.</w:t>
-      </w:r>
-    </w:p>
-    <w:p>
-      <w:pPr>
-        <w:spacing w:after="160"/>
-      </w:pPr>
-      <w:r>
-        <w:t xml:space="preserve">Il secondo Storyboard è la Dashboard principale, da cui sono raggiungibili tutte le funzionalità del sistema.</w:t>
+        <w:t xml:space="preserve">Mockup 1 — Login and Registration Storyboard (LoginBoundary / RegisterBoundary)</w:t>
+      </w:r>
+    </w:p>
+    <w:p>
+      <w:pPr>
+        <w:spacing w:after="160"/>
+      </w:pPr>
+      <w:r>
+        <w:t xml:space="preserve">The login screen uses the modern design system introduced in the project: a light background with a rounded, shadowed central card, and an indigo/violet palette (#4f46e5 → #6366f1) consistent across the whole application. Two fields collect username and password. An error label, initially empty, appears in red below the fields when credentials are rejected by the LoginController. A secondary button leads to the registration form, where first and last name, username, password and — optionally — the home town/municipality (selectable from a location dropdown) are collected and validated before a Student entity is persisted.</w:t>
+      </w:r>
+    </w:p>
+    <w:p>
+      <w:pPr>
+        <w:spacing w:after="160"/>
+      </w:pPr>
+      <w:r>
+        <w:t xml:space="preserve">The second Storyboard is the main Dashboard, from which all the system's features can be reached.</w:t>
       </w:r>
     </w:p>
     <w:p>
@@ -1837,7 +1837,7 @@
           <w:i/>
           <w:iCs/>
         </w:rPr>
-        <w:t xml:space="preserve">Storyboard 2 — Dashboard e gestione delle prenotazioni</w:t>
+        <w:t xml:space="preserve">Storyboard 2 — Dashboard and booking management</w:t>
       </w:r>
     </w:p>
     <w:p>
@@ -1899,15 +1899,15 @@
           <w:sz w:val="20"/>
           <w:szCs w:val="20"/>
         </w:rPr>
-        <w:t xml:space="preserve">Mockup 2 — Storyboard Dashboard e Le Mie Corse (StudentDashboardBoundary / ManageRidesBoundary)</w:t>
-      </w:r>
-    </w:p>
-    <w:p>
-      <w:pPr>
-        <w:spacing w:after="160"/>
-      </w:pPr>
-      <w:r>
-        <w:t xml:space="preserve">La Dashboard è costruita su un BorderPane JavaFX. La barra superiore, con sfondo a gradiente indaco/violetto, mostra il logo dell'applicazione, un'etichetta di benvenuto personalizzata col nome dello studente loggato e un bottone Logout allineato a destra. Il centro del layout presenta tre grandi bottoni di navigazione: Offri Passaggio, Cerca Passaggio e Le Mie Corse, che caricano ciascuno la propria vista FXML sostituendo la Scene corrente sullo Stage. La schermata 'Le Mie Corse' è organizzata in due tab: la prima elenca le corse offerte come guidatore, con le richieste di prenotazione pendenti e i bottoni Conferma/Rifiuta, Completa Corsa e Annulla Corsa; la seconda elenca le prenotazioni attive come passeggero, con il relativo stato (In attesa/Confermata) e un bottone per annullarle.</w:t>
+        <w:t xml:space="preserve">Mockup 2 — Dashboard and My Rides Storyboard (StudentDashboardBoundary / ManageRidesBoundary)</w:t>
+      </w:r>
+    </w:p>
+    <w:p>
+      <w:pPr>
+        <w:spacing w:after="160"/>
+      </w:pPr>
+      <w:r>
+        <w:t xml:space="preserve">The Dashboard is built on a JavaFX BorderPane. The top bar, with an indigo/violet gradient background, shows the application logo, a welcome label personalized with the logged-in student's name, and a Logout button aligned to the right. The center of the layout presents three large navigation buttons: Offri Passaggio, Cerca Passaggio and Le Mie Corse, each of which loads its own FXML view, replacing the current Scene on the Stage. The 'Le Mie Corse' screen is organized into two tabs: the first lists the rides offered as a driver, with pending booking requests and the Confirm/Reject, Complete Ride and Cancel Ride buttons; the second lists active bookings as a passenger, with their status (Pending/Confirmed) and a button to cancel them.</w:t>
       </w:r>
     </w:p>
     <w:p>
@@ -1924,7 +1924,7 @@
         <w:spacing w:after="160"/>
       </w:pPr>
       <w:r>
-        <w:t xml:space="preserve">In questa sezione vengono esposte le principali caratteristiche interne del sistema, con alcuni diagrammi per rappresentarle.</w:t>
+        <w:t xml:space="preserve">This section presents the system's main internal characteristics, with diagrams to illustrate them.</w:t>
       </w:r>
     </w:p>
     <w:p>
@@ -1941,7 +1941,7 @@
         <w:spacing w:after="160"/>
       </w:pPr>
       <w:r>
-        <w:t xml:space="preserve">Data la dimensione del sistema, il diagramma delle classi a livello di analisi viene presentato in un unico diagramma combinato, con le classi raggruppate nelle quattro fasce colorate del pattern Boundary-Control-Entity, più lo strato Bean per i DTO che attraversano i confini architetturali. Le famiglie DAO, troppo numerose per restare leggibili nello stesso diagramma, sono illustrate separatamente subito dopo; una panoramica globale di come tutti i livelli interagiscono chiude la sezione.</w:t>
+        <w:t xml:space="preserve">Given the size of the system, the analysis-level class diagram is presented as a single combined diagram, with classes grouped into the four colored bands of the Boundary-Control-Entity pattern, plus the Bean layer for the DTOs that cross architectural boundaries. The DAO families, too numerous to remain legible in the same diagram, are illustrated separately right after; a global overview of how all the layers interact closes the section.</w:t>
       </w:r>
     </w:p>
     <w:p>
@@ -1952,7 +1952,7 @@
       <w:r>
         <w:drawing>
           <wp:inline distT="0" distB="0" distL="0" distR="0">
-            <wp:extent cx="5715000" cy="3922643"/>
+            <wp:extent cx="5715000" cy="3856167"/>
             <wp:effectExtent t="0" r="0" b="0" l="0"/>
             <wp:docPr id="1" name="" descr="" title=""/>
             <wp:cNvGraphicFramePr>
@@ -1977,7 +1977,7 @@
                   <pic:spPr bwMode="auto">
                     <a:xfrm>
                       <a:off x="0" y="0"/>
-                      <a:ext cx="5715000" cy="3922643"/>
+                      <a:ext cx="5715000" cy="3856167"/>
                     </a:xfrm>
                     <a:prstGeom prst="rect">
                       <a:avLst/>
@@ -2003,15 +2003,15 @@
           <w:sz w:val="20"/>
           <w:szCs w:val="20"/>
         </w:rPr>
-        <w:t xml:space="preserve">Figura 2 — Diagramma delle classi combinato: Boundary, Bean, Control ed Entity</w:t>
-      </w:r>
-    </w:p>
-    <w:p>
-      <w:pPr>
-        <w:spacing w:after="160"/>
-      </w:pPr>
-      <w:r>
-        <w:t xml:space="preserve">Lo strato Boundary contiene esclusivamente classi che interagiscono con l'utente: i controller JavaFX collegati alle rispettive viste FXML scambiano solo oggetti Bean con lo strato Control, mai le Entity direttamente. Ogni Boundary gestisce da sé il caricamento del proprio FXML e lo scambio della Scene sullo Stage: non esiste una classe SceneManager centralizzata (CliMain e i vari *CLI offrono un'interfaccia testuale equivalente per ambienti headless, omessi qui per non appesantire il diagramma). Lo strato Bean racchiude i DTO (RideBean, BookingBean, UserBean) che attraversano il confine Boundary↔Control: nessuna Entity lascia mai lo strato di dominio verso la UI. Lo strato Control incapsula tutta la logica di business: ogni controller riceve i Bean dalla Boundary, li valida, orchestra le Entity e delega la persistenza allo strato DAO (illustrato separatamente subito dopo); nessuna di queste classi dipende da JavaFX, il che consente agli stessi controller di servire sia la GUI sia la CLI senza modifiche. Il Singleton Session fornisce a tutti i controller l'identità dello studente attualmente autenticato. Lo strato Entity rappresenta infine le classi di dominio: Ride è l'entità più ricca, con la lista degli observer registrati e i metodi che innescano le proprie transizioni di stato (bookSeat, cancelSeat, complete, cancel); Booking modella lo stato di approvazione di ogni singola richiesta di prenotazione, senza duplicare la logica di riserva del posto già gestita da Ride.</w:t>
+        <w:t xml:space="preserve">Figure 2 — Combined class diagram: Boundary, Bean, Control and Entity</w:t>
+      </w:r>
+    </w:p>
+    <w:p>
+      <w:pPr>
+        <w:spacing w:after="160"/>
+      </w:pPr>
+      <w:r>
+        <w:t xml:space="preserve">The Boundary layer contains exclusively classes that interact with the user: the JavaFX controllers bound to their respective FXML views exchange only Bean objects with the Control layer, never Entities directly. Each Boundary manages the loading of its own FXML and the Scene swap on the Stage by itself: there is no centralized SceneManager class (CliMain and the various *CLI classes offer an equivalent text-based interface for headless environments, omitted here to keep the diagram readable). The Bean layer holds the DTOs (RideBean, BookingBean, UserBean) that cross the Boundary↔Control boundary: no Entity ever leaves the domain layer toward the UI. The Control layer encapsulates all the business logic: each controller receives Beans from the Boundary, validates them, orchestrates the Entities and delegates persistence to the DAO layer (illustrated separately right after); none of these classes depends on JavaFX, which lets the same controllers serve both the GUI and the CLI without modification. The Session Singleton provides every controller with the identity of the currently authenticated student. Finally, the Entity layer represents the domain classes: Ride is the richest entity, with the list of registered observers and the methods that trigger its own state transitions (bookSeat, cancelSeat, complete, cancel); Booking models the approval status of each individual booking request, without duplicating the seat-reservation logic already handled by Ride.</w:t>
       </w:r>
     </w:p>
     <w:p>
@@ -2023,7 +2023,7 @@
           <w:i/>
           <w:iCs/>
         </w:rPr>
-        <w:t xml:space="preserve">La parte DAO — Abstract Factory:</w:t>
+        <w:t xml:space="preserve">The DAO section — Abstract Factory:</w:t>
       </w:r>
     </w:p>
     <w:p>
@@ -2085,15 +2085,15 @@
           <w:sz w:val="20"/>
           <w:szCs w:val="20"/>
         </w:rPr>
-        <w:t xml:space="preserve">Figura 3 — DAOFactory e le sue Concrete Factory</w:t>
-      </w:r>
-    </w:p>
-    <w:p>
-      <w:pPr>
-        <w:spacing w:after="160"/>
-      </w:pPr>
-      <w:r>
-        <w:t xml:space="preserve">DAOFactory è l'unico punto d'ingresso allo strato di persistenza. Legge la costante PERSISTENCE_TYPE da Config alla prima invocazione di getInstance() e mette in cache la corrispondente factory concreta, così che ogni controller del sistema riceva oggetti DAO appartenenti alla stessa famiglia coerente.</w:t>
+        <w:t xml:space="preserve">Figure 3 — DAOFactory and its Concrete Factories</w:t>
+      </w:r>
+    </w:p>
+    <w:p>
+      <w:pPr>
+        <w:spacing w:after="160"/>
+      </w:pPr>
+      <w:r>
+        <w:t xml:space="preserve">DAOFactory is the single entry point into the persistence layer. It reads the PERSISTENCE_TYPE constant from Config on the first call to getInstance() and caches the corresponding concrete factory, so that every controller in the system receives DAO objects belonging to the same consistent family.</w:t>
       </w:r>
     </w:p>
     <w:p>
@@ -2105,7 +2105,7 @@
           <w:i/>
           <w:iCs/>
         </w:rPr>
-        <w:t xml:space="preserve">La parte DAO — famiglia In-Memory:</w:t>
+        <w:t xml:space="preserve">The DAO section — In-Memory family:</w:t>
       </w:r>
     </w:p>
     <w:p>
@@ -2167,15 +2167,15 @@
           <w:sz w:val="20"/>
           <w:szCs w:val="20"/>
         </w:rPr>
-        <w:t xml:space="preserve">Figura 4 — DAO In-Memory</w:t>
-      </w:r>
-    </w:p>
-    <w:p>
-      <w:pPr>
-        <w:spacing w:after="160"/>
-      </w:pPr>
-      <w:r>
-        <w:t xml:space="preserve">Le implementazioni In-Memory appoggiano ogni interfaccia su una HashMap statica condivisa tramite il Singleton MemoryStorage, indicizzata per identificativo dell'entità, garantendo un accesso a tempo costante. È la famiglia restituita nella modalità di persistenza di default dell'applicazione.</w:t>
+        <w:t xml:space="preserve">Figure 4 — In-Memory DAO</w:t>
+      </w:r>
+    </w:p>
+    <w:p>
+      <w:pPr>
+        <w:spacing w:after="160"/>
+      </w:pPr>
+      <w:r>
+        <w:t xml:space="preserve">The In-Memory implementations back every interface with a static HashMap shared through the MemoryStorage Singleton, indexed by entity identifier, guaranteeing constant-time access. It is the family returned in the application's default persistence mode.</w:t>
       </w:r>
     </w:p>
     <w:p>
@@ -2187,7 +2187,7 @@
           <w:i/>
           <w:iCs/>
         </w:rPr>
-        <w:t xml:space="preserve">La parte DAO — famiglia File System:</w:t>
+        <w:t xml:space="preserve">The DAO section — File System family:</w:t>
       </w:r>
     </w:p>
     <w:p>
@@ -2249,15 +2249,15 @@
           <w:sz w:val="20"/>
           <w:szCs w:val="20"/>
         </w:rPr>
-        <w:t xml:space="preserve">Figura 5 — DAO File System</w:t>
-      </w:r>
-    </w:p>
-    <w:p>
-      <w:pPr>
-        <w:spacing w:after="160"/>
-      </w:pPr>
-      <w:r>
-        <w:t xml:space="preserve">Le implementazioni File System gestiscono ciascuna in autonomia il proprio file CSV, con un caching in memoria invalidato in base al timestamp di ultima modifica e un lock esplicito per la concorrenza in scrittura: non esiste una classe CsvHelper condivisa fra le tre implementazioni.</w:t>
+        <w:t xml:space="preserve">Figure 5 — File System DAO</w:t>
+      </w:r>
+    </w:p>
+    <w:p>
+      <w:pPr>
+        <w:spacing w:after="160"/>
+      </w:pPr>
+      <w:r>
+        <w:t xml:space="preserve">The File System implementations each independently manage their own CSV file, with in-memory caching invalidated based on the last-modified timestamp, and an explicit lock for write concurrency: there is no CsvHelper class shared among the three implementations.</w:t>
       </w:r>
     </w:p>
     <w:p>
@@ -2269,7 +2269,7 @@
           <w:i/>
           <w:iCs/>
         </w:rPr>
-        <w:t xml:space="preserve">La parte DAO — famiglia SQL (database relazionale):</w:t>
+        <w:t xml:space="preserve">The DAO section — SQL family (relational database):</w:t>
       </w:r>
     </w:p>
     <w:p>
@@ -2331,15 +2331,15 @@
           <w:sz w:val="20"/>
           <w:szCs w:val="20"/>
         </w:rPr>
-        <w:t xml:space="preserve">Figura 6 — DAO SQL (H2 via JDBC)</w:t>
-      </w:r>
-    </w:p>
-    <w:p>
-      <w:pPr>
-        <w:spacing w:after="160"/>
-      </w:pPr>
-      <w:r>
-        <w:t xml:space="preserve">Le implementazioni SQL si appoggiano a JdbcSupport, una classe di supporto package-private che apre la connessione JDBC verso il database H2 embedded e ne inizializza lo schema (CREATE TABLE IF NOT EXISTS) alla prima richiesta. Ogni Jdbc*DAO traduce le proprie operazioni in query preparate: le scritture usano la sintassi di upsert MERGE INTO ... KEY (...) VALUES (...) propria di H2, mentre JdbcRideDAO gestisce in una singola transazione anche la tabella di collegamento ride_passengers, necessaria a rappresentare la relazione molti-a-molti fra un passaggio e i propri passeggeri senza appiattirla in una colonna come nella variante CSV.</w:t>
+        <w:t xml:space="preserve">Figure 6 — SQL DAO (H2 via JDBC)</w:t>
+      </w:r>
+    </w:p>
+    <w:p>
+      <w:pPr>
+        <w:spacing w:after="160"/>
+      </w:pPr>
+      <w:r>
+        <w:t xml:space="preserve">The SQL implementations rely on JdbcSupport, a package-private support class that opens the JDBC connection to the embedded H2 database and initializes its schema (CREATE TABLE IF NOT EXISTS) on first request. Each Jdbc*DAO translates its operations into prepared statements: writes use H2's own MERGE INTO ... KEY (...) VALUES (...) upsert syntax, while JdbcRideDAO also manages, within a single transaction, the ride_passengers join table, needed to represent the many-to-many relationship between a ride and its passengers without flattening it into a column as in the CSV variant.</w:t>
       </w:r>
     </w:p>
     <w:p>
@@ -2351,7 +2351,7 @@
           <w:i/>
           <w:iCs/>
         </w:rPr>
-        <w:t xml:space="preserve">La vista globale del diagramma delle classi:</w:t>
+        <w:t xml:space="preserve">The global view of the class diagram:</w:t>
       </w:r>
     </w:p>
     <w:p>
@@ -2413,7 +2413,7 @@
           <w:sz w:val="20"/>
           <w:szCs w:val="20"/>
         </w:rPr>
-        <w:t xml:space="preserve">Figura 7 — Panoramica architetturale a livello di package</w:t>
+        <w:t xml:space="preserve">Figure 7 — Package-level architectural overview</w:t>
       </w:r>
     </w:p>
     <w:p>
@@ -2430,7 +2430,7 @@
         <w:spacing w:after="160"/>
       </w:pPr>
       <w:r>
-        <w:t xml:space="preserve">Il diagramma a livello di design mette in evidenza i pattern applicati che più elevano il livello ingegneristico del sistema: il Pattern Observer, che disaccoppia la notifica dei passeggeri dal Ride stesso, e il Pattern Strategy, che rende intercambiabile l'algoritmo di suddivisione dei costi.</w:t>
+        <w:t xml:space="preserve">The design-level diagram highlights the applied patterns that most raise the system's engineering level: the Observer Pattern, which decouples passenger notification from the Ride itself, and the Strategy Pattern, which makes the cost-splitting algorithm interchangeable.</w:t>
       </w:r>
     </w:p>
     <w:p>
@@ -2442,7 +2442,7 @@
           <w:i/>
           <w:iCs/>
         </w:rPr>
-        <w:t xml:space="preserve">La parte Pattern:</w:t>
+        <w:t xml:space="preserve">The Pattern section:</w:t>
       </w:r>
     </w:p>
     <w:p>
@@ -2453,7 +2453,7 @@
       <w:r>
         <w:drawing>
           <wp:inline distT="0" distB="0" distL="0" distR="0">
-            <wp:extent cx="5334000" cy="5334000"/>
+            <wp:extent cx="5334000" cy="5061029"/>
             <wp:effectExtent t="0" r="0" b="0" l="0"/>
             <wp:docPr id="1" name="" descr="" title=""/>
             <wp:cNvGraphicFramePr>
@@ -2478,7 +2478,7 @@
                   <pic:spPr bwMode="auto">
                     <a:xfrm>
                       <a:off x="0" y="0"/>
-                      <a:ext cx="5334000" cy="5334000"/>
+                      <a:ext cx="5334000" cy="5061029"/>
                     </a:xfrm>
                     <a:prstGeom prst="rect">
                       <a:avLst/>
@@ -2504,15 +2504,15 @@
           <w:sz w:val="20"/>
           <w:szCs w:val="20"/>
         </w:rPr>
-        <w:t xml:space="preserve">Figura 8 — Observer e Strategy applicati a Ride e al calcolo dei costi</w:t>
-      </w:r>
-    </w:p>
-    <w:p>
-      <w:pPr>
-        <w:spacing w:after="160"/>
-      </w:pPr>
-      <w:r>
-        <w:t xml:space="preserve">A sinistra, Ride ricopre il ruolo di Subject e mantiene una lista di riferimenti Observer senza conoscerne il tipo concreto (nel codice, un observer è spesso una semplice lambda registrata dal Controller al momento della richiesta). A destra, SearchRideController sceglie dinamicamente quale CostStrategy applicare in base a Config.COST_STRATEGY_TYPE, permettendo di aggiungere un nuovo modello di tariffazione senza toccare il codice esistente.</w:t>
+        <w:t xml:space="preserve">Figure 8 — Observer and Strategy applied to Ride and cost calculation</w:t>
+      </w:r>
+    </w:p>
+    <w:p>
+      <w:pPr>
+        <w:spacing w:after="160"/>
+      </w:pPr>
+      <w:r>
+        <w:t xml:space="preserve">On the left, Ride plays the role of Subject and keeps a list of Observer references without knowing their concrete type (in the code, an observer is often a simple lambda registered by the Controller at request time). On the right, SearchRideController dynamically chooses which CostStrategy to apply based on Config.COST_STRATEGY_TYPE, allowing a new pricing model to be added without touching the existing code.</w:t>
       </w:r>
     </w:p>
     <w:p>
@@ -2541,7 +2541,7 @@
         <w:spacing w:after="160"/>
       </w:pPr>
       <w:r>
-        <w:t xml:space="preserve">Nel sistema è stato implementato il Pattern Abstract Factory, il cui scopo principale è fornire un'interfaccia per creare famiglie di oggetti correlati senza specificarne le classi concrete. DAOFactory è una classe astratta che espone tre metodi factory: getRideDAO(), getStudentDAO() e getBookingDAO(). Tre sottoclassi concrete la estendono e istanziano le implementazioni corrette in base al valore di Config.PERSISTENCE_TYPE: MemoryDAOFactory (HashMap in RAM), FsDAOFactory (file CSV) e SqlDAOFactory (database relazionale H2 via JDBC). Grazie a questo design, cambiare l'intera applicazione da una tecnologia di persistenza a un'altra richiede di modificare un'unica costante, e nessuna classe Controller è consapevole di quale tecnologia stia effettivamente memorizzando i dati.</w:t>
+        <w:t xml:space="preserve">The system implements the Abstract Factory Pattern, whose main purpose is to provide an interface for creating families of related objects without specifying their concrete classes. DAOFactory is an abstract class that exposes three factory methods: getRideDAO(), getStudentDAO() and getBookingDAO(). Three concrete subclasses extend it and instantiate the correct implementations based on the value of Config.PERSISTENCE_TYPE: MemoryDAOFactory (in-RAM HashMap), FsDAOFactory (CSV files) and SqlDAOFactory (relational H2 database via JDBC). Thanks to this design, switching the entire application from one persistence technology to another requires changing a single constant, and no Controller class is aware of which technology is actually storing the data.</w:t>
       </w:r>
     </w:p>
     <w:p>
@@ -2553,15 +2553,15 @@
           <w:b/>
           <w:bCs/>
         </w:rPr>
-        <w:t xml:space="preserve">Singleton — Session, MemoryStorage e DAOFactory</w:t>
-      </w:r>
-    </w:p>
-    <w:p>
-      <w:pPr>
-        <w:spacing w:after="160"/>
-      </w:pPr>
-      <w:r>
-        <w:t xml:space="preserve">Il Pattern Singleton garantisce che esista una e una sola istanza di un dato tipo di oggetto, così che tutte le azioni su quell'oggetto siano eseguite in modo coerente. Session mantiene lo Student attualmente autenticato ed è raggiungibile globalmente tramite Session.getInstance(). MemoryStorage centralizza le HashMap condivise dalla famiglia di DAO in memoria. DAOFactory stessa mette in cache la factory concreta scelta in un campo statico protetto da un accessor synchronized.</w:t>
+        <w:t xml:space="preserve">Singleton — Session, MemoryStorage and DAOFactory</w:t>
+      </w:r>
+    </w:p>
+    <w:p>
+      <w:pPr>
+        <w:spacing w:after="160"/>
+      </w:pPr>
+      <w:r>
+        <w:t xml:space="preserve">The Singleton Pattern guarantees that one and only one instance of a given object type exists, so that all actions on that object are performed consistently. Session holds the currently authenticated Student and is globally reachable via Session.getInstance(). MemoryStorage centralizes the HashMaps shared by the in-memory DAO family. DAOFactory itself caches the chosen concrete factory in a static field protected by a synchronized accessor.</w:t>
       </w:r>
     </w:p>
     <w:p>
@@ -2581,7 +2581,7 @@
         <w:spacing w:after="160"/>
       </w:pPr>
       <w:r>
-        <w:t xml:space="preserve">Il Pattern State modella il ciclo di vita di un passaggio. L'interfaccia RideState definisce i quattro stati concreti che un Ride può assumere (AvailableState, FullState, CompletedState, CancelledState), e ogni transizione è innescata esclusivamente da un metodo su Ride stesso (bookSeat, cancelSeat, complete, cancel), così che il campo state non possa mai divergere dal reale numero di posti disponibili né da transizioni non ammesse (i due stati terminali COMPLETED e CANCELLED rifiutano qualunque ulteriore transizione). L'entità Booking adotta invece un approccio più leggero: uno stato testuale con transizioni validate direttamente dai propri metodi confirm()/reject()/cancel(), senza una gerarchia di classi State dedicata.</w:t>
+        <w:t xml:space="preserve">The State Pattern models the lifecycle of a ride. The RideState interface defines the four concrete states a Ride can take on (AvailableState, FullState, CompletedState, CancelledState), and every transition is triggered exclusively by a method on Ride itself (bookSeat, cancelSeat, complete, cancel), so the state field can never diverge from the actual number of available seats or from disallowed transitions (the two terminal states, COMPLETED and CANCELLED, reject any further transition). The Booking entity instead adopts a lighter approach: a textual state with transitions validated directly by its own confirm()/reject()/cancel() methods, without a dedicated State class hierarchy.</w:t>
       </w:r>
     </w:p>
     <w:p>
@@ -2601,7 +2601,7 @@
         <w:spacing w:after="160"/>
       </w:pPr>
       <w:r>
-        <w:t xml:space="preserve">Il Pattern Strategy incapsula una famiglia di algoritmi intercambiabili. CostStrategy dichiara il singolo metodo calculateCost(basePrice, numPassengers). EqualSplitStrategy divide il costo totale in parti uguali fra guidatore e passeggeri, mentre DistanceCostStrategy calcola il costo in base alla distanza. SearchRideController sceglie dinamicamente quale strategia istanziare in base a Config.COST_STRATEGY_TYPE ad ogni ricerca, così l'algoritmo può essere cambiato modificando un'unica costante.</w:t>
+        <w:t xml:space="preserve">The Strategy Pattern encapsulates a family of interchangeable algorithms. CostStrategy declares the single method calculateCost(basePrice, numPassengers). EqualSplitStrategy divides the total cost equally between driver and passengers, while DistanceCostStrategy calculates the cost based on distance. SearchRideController dynamically chooses which strategy to instantiate based on Config.COST_STRATEGY_TYPE on every search, so the algorithm can be changed by modifying a single constant.</w:t>
       </w:r>
     </w:p>
     <w:p>
@@ -2613,15 +2613,15 @@
           <w:b/>
           <w:bCs/>
         </w:rPr>
-        <w:t xml:space="preserve">Observer — Ride e i passeggeri iscritti</w:t>
-      </w:r>
-    </w:p>
-    <w:p>
-      <w:pPr>
-        <w:spacing w:after="160"/>
-      </w:pPr>
-      <w:r>
-        <w:t xml:space="preserve">Il Pattern Observer definisce una dipendenza uno-a-molti così che, quando un oggetto cambia stato, tutti i suoi dipendenti vengano notificati automaticamente. Ride mantiene una lista di istanze Observer e invoca notifyObservers() ogni volta che un posto viene richiesto, liberato, o la corsa viene annullata. Nel prototipo, l'Observer registrato alla richiesta di un posto è tipicamente una funzione lambda che registra la notifica tramite LoggerCustom.</w:t>
+        <w:t xml:space="preserve">Observer — Ride and its subscribed passengers</w:t>
+      </w:r>
+    </w:p>
+    <w:p>
+      <w:pPr>
+        <w:spacing w:after="160"/>
+      </w:pPr>
+      <w:r>
+        <w:t xml:space="preserve">The Observer Pattern defines a one-to-many dependency so that, when an object changes state, all its dependents are automatically notified. Ride keeps a list of Observer instances and invokes notifyObservers() whenever a seat is requested, freed, or the ride is cancelled. In the prototype, the Observer registered when a seat is requested is typically a lambda function that logs the notification via LoggerCustom.</w:t>
       </w:r>
     </w:p>
     <w:p>
@@ -2638,7 +2638,7 @@
         <w:spacing w:after="160"/>
       </w:pPr>
       <w:r>
-        <w:t xml:space="preserve">Il seguente diagramma di attività descrive il ramo principale del flusso di login/registrazione insieme alle funzionalità principali del sistema:</w:t>
+        <w:t xml:space="preserve">The following activity diagram describes the main flow of a booking request, from the ride search to the driver's confirmation or rejection:</w:t>
       </w:r>
     </w:p>
     <w:p>
@@ -2649,7 +2649,7 @@
       <w:r>
         <w:drawing>
           <wp:inline distT="0" distB="0" distL="0" distR="0">
-            <wp:extent cx="5715000" cy="4767360"/>
+            <wp:extent cx="4572000" cy="8226903"/>
             <wp:effectExtent t="0" r="0" b="0" l="0"/>
             <wp:docPr id="1" name="" descr="" title=""/>
             <wp:cNvGraphicFramePr>
@@ -2674,7 +2674,7 @@
                   <pic:spPr bwMode="auto">
                     <a:xfrm>
                       <a:off x="0" y="0"/>
-                      <a:ext cx="5715000" cy="4767360"/>
+                      <a:ext cx="4572000" cy="8226903"/>
                     </a:xfrm>
                     <a:prstGeom prst="rect">
                       <a:avLst/>
@@ -2700,7 +2700,7 @@
           <w:sz w:val="20"/>
           <w:szCs w:val="20"/>
         </w:rPr>
-        <w:t xml:space="preserve">Figura 9 — Diagramma di attività del flusso applicativo principale</w:t>
+        <w:t xml:space="preserve">Figure 9 — Activity diagram of the main application flow</w:t>
       </w:r>
     </w:p>
     <w:p>
@@ -2717,7 +2717,7 @@
         <w:spacing w:after="160"/>
       </w:pPr>
       <w:r>
-        <w:t xml:space="preserve">Il ramo principale del sistema è descritto nel seguente diagramma di sequenza, esteso dal login fino alla richiesta di prenotazione: lo studente accede (LoginController verifica le credenziali tramite StudentDAO e apre la sessione), naviga verso 'Cerca Passaggio', ottiene i risultati disponibili da RideDAO e infine seleziona un passaggio. SearchRideController valida la richiesta rispetto alla sessione e allo stato del Ride, riserva il posto, crea un Booking in stato REQUESTED e lo persiste; la notifica al passeggero (Pattern Observer) è modellata come chiamata asincrona.</w:t>
+        <w:t xml:space="preserve">The system's main branch is described in the following sequence diagram, extended from login to the booking request: the student logs in (LoginController verifies the credentials via StudentDAO and opens the session), navigates to 'Cerca Passaggio', obtains the available results from RideDAO, and finally selects a ride. SearchRideController validates the request against the session and the Ride's state, reserves the seat, creates a Booking in the REQUESTED state and persists it; the notification to the passenger (Observer Pattern) is modeled as an asynchronous call.</w:t>
       </w:r>
     </w:p>
     <w:p>
@@ -2728,7 +2728,7 @@
       <w:r>
         <w:drawing>
           <wp:inline distT="0" distB="0" distL="0" distR="0">
-            <wp:extent cx="5715000" cy="4532243"/>
+            <wp:extent cx="5715000" cy="2536760"/>
             <wp:effectExtent t="0" r="0" b="0" l="0"/>
             <wp:docPr id="1" name="" descr="" title=""/>
             <wp:cNvGraphicFramePr>
@@ -2753,7 +2753,7 @@
                   <pic:spPr bwMode="auto">
                     <a:xfrm>
                       <a:off x="0" y="0"/>
-                      <a:ext cx="5715000" cy="4532243"/>
+                      <a:ext cx="5715000" cy="2536760"/>
                     </a:xfrm>
                     <a:prstGeom prst="rect">
                       <a:avLst/>
@@ -2779,7 +2779,7 @@
           <w:sz w:val="20"/>
           <w:szCs w:val="20"/>
         </w:rPr>
-        <w:t xml:space="preserve">Figura 10 — Sequence Diagram del flusso login → ricerca → richiesta di prenotazione</w:t>
+        <w:t xml:space="preserve">Figure 10 — Sequence Diagram of the login → search → booking request flow</w:t>
       </w:r>
     </w:p>
     <w:p>
@@ -2796,7 +2796,7 @@
         <w:spacing w:after="160"/>
       </w:pPr>
       <w:r>
-        <w:t xml:space="preserve">Due macchine a stati governano il sistema. La prima descrive il ciclo di vita di un Ride:</w:t>
+        <w:t xml:space="preserve">Two state machines govern the system. The first describes the lifecycle of a Ride:</w:t>
       </w:r>
     </w:p>
     <w:p>
@@ -2807,7 +2807,7 @@
       <w:r>
         <w:drawing>
           <wp:inline distT="0" distB="0" distL="0" distR="0">
-            <wp:extent cx="4572000" cy="3716642"/>
+            <wp:extent cx="4572000" cy="3695928"/>
             <wp:effectExtent t="0" r="0" b="0" l="0"/>
             <wp:docPr id="1" name="" descr="" title=""/>
             <wp:cNvGraphicFramePr>
@@ -2832,7 +2832,7 @@
                   <pic:spPr bwMode="auto">
                     <a:xfrm>
                       <a:off x="0" y="0"/>
-                      <a:ext cx="4572000" cy="3716642"/>
+                      <a:ext cx="4572000" cy="3695928"/>
                     </a:xfrm>
                     <a:prstGeom prst="rect">
                       <a:avLst/>
@@ -2858,15 +2858,15 @@
           <w:sz w:val="20"/>
           <w:szCs w:val="20"/>
         </w:rPr>
-        <w:t xml:space="preserve">Figura 11 — State Diagram di Ride</w:t>
-      </w:r>
-    </w:p>
-    <w:p>
-      <w:pPr>
-        <w:spacing w:after="160"/>
-      </w:pPr>
-      <w:r>
-        <w:t xml:space="preserve">La seconda descrive il ciclo di vita di un Booking. Sia il rifiuto sia l'annullamento innescano il rilascio del posto riservato sul Ride associato:</w:t>
+        <w:t xml:space="preserve">Figure 11 — State Diagram of Ride</w:t>
+      </w:r>
+    </w:p>
+    <w:p>
+      <w:pPr>
+        <w:spacing w:after="160"/>
+      </w:pPr>
+      <w:r>
+        <w:t xml:space="preserve">The second describes the lifecycle of a Booking. Both rejection and cancellation trigger the release of the seat reserved on the associated Ride:</w:t>
       </w:r>
     </w:p>
     <w:p>
@@ -2877,7 +2877,7 @@
       <w:r>
         <w:drawing>
           <wp:inline distT="0" distB="0" distL="0" distR="0">
-            <wp:extent cx="3657600" cy="3411761"/>
+            <wp:extent cx="3657600" cy="2748215"/>
             <wp:effectExtent t="0" r="0" b="0" l="0"/>
             <wp:docPr id="1" name="" descr="" title=""/>
             <wp:cNvGraphicFramePr>
@@ -2902,7 +2902,7 @@
                   <pic:spPr bwMode="auto">
                     <a:xfrm>
                       <a:off x="0" y="0"/>
-                      <a:ext cx="3657600" cy="3411761"/>
+                      <a:ext cx="3657600" cy="2748215"/>
                     </a:xfrm>
                     <a:prstGeom prst="rect">
                       <a:avLst/>
@@ -2928,7 +2928,7 @@
           <w:sz w:val="20"/>
           <w:szCs w:val="20"/>
         </w:rPr>
-        <w:t xml:space="preserve">Figura 12 — State Diagram di Booking</w:t>
+        <w:t xml:space="preserve">Figure 12 — State Diagram of Booking</w:t>
       </w:r>
     </w:p>
     <w:p>
@@ -2945,7 +2945,7 @@
         <w:spacing w:after="160"/>
       </w:pPr>
       <w:r>
-        <w:t xml:space="preserve">Oltre alle classi che verificano lo strato di dominio e i pattern applicati, la suite include una classe di test dedicata per ciascuna famiglia di DAO (In-Memory, File System e SQL), così da coprire anche lo strato di persistenza e non solo la logica di business.</w:t>
+        <w:t xml:space="preserve">In addition to the classes that verify the domain layer and the applied patterns, the suite includes a dedicated test class for each DAO family (In-Memory, File System and SQL), so as to also cover the persistence layer and not just the business logic.</w:t>
       </w:r>
     </w:p>
     <w:tbl>
@@ -2985,7 +2985,7 @@
                 <w:sz w:val="20"/>
                 <w:szCs w:val="20"/>
               </w:rPr>
-              <w:t xml:space="preserve">Classe di Test</w:t>
+              <w:t xml:space="preserve">Test Class</w:t>
             </w:r>
           </w:p>
         </w:tc>
@@ -3009,7 +3009,7 @@
                 <w:sz w:val="20"/>
                 <w:szCs w:val="20"/>
               </w:rPr>
-              <w:t xml:space="preserve">Casi di Test</w:t>
+              <w:t xml:space="preserve">Test Cases</w:t>
             </w:r>
           </w:p>
         </w:tc>
@@ -3057,7 +3057,7 @@
                 <w:sz w:val="20"/>
                 <w:szCs w:val="20"/>
               </w:rPr>
-              <w:t xml:space="preserve">stato iniziale AVAILABLE; transizione a FULL all'ultimo posto; rifiuto prenotazione a macchina piena; ripristino stato AVAILABLE alla cancellazione</w:t>
+              <w:t xml:space="preserve">initial AVAILABLE state; transition to FULL on the last seat; booking rejected when the ride is full; AVAILABLE state restored on cancellation</w:t>
             </w:r>
           </w:p>
         </w:tc>
@@ -3105,7 +3105,7 @@
                 <w:sz w:val="20"/>
                 <w:szCs w:val="20"/>
               </w:rPr>
-              <w:t xml:space="preserve">suddivisione equa del costo con più passeggeri; nessun passeggero (costo interamente a carico del guidatore); divisione 50/50 con un passeggero</w:t>
+              <w:t xml:space="preserve">equal cost split with multiple passengers; no passengers (cost entirely borne by the driver); 50/50 split with one passenger</w:t>
             </w:r>
           </w:p>
         </w:tc>
@@ -3153,7 +3153,7 @@
                 <w:sz w:val="20"/>
                 <w:szCs w:val="20"/>
               </w:rPr>
-              <w:t xml:space="preserve">nuova richiesta in stato REQUESTED; conferma di una richiesta pendente; rifiuto con rilascio del posto; impossibilità di confermare/rifiutare una richiesta già gestita; annullamento da parte del passeggero</w:t>
+              <w:t xml:space="preserve">new request in the REQUESTED state; confirmation of a pending request; rejection with seat release; inability to confirm/reject a request that has already been handled; cancellation by the passenger</w:t>
             </w:r>
           </w:p>
         </w:tc>
@@ -3201,7 +3201,7 @@
                 <w:sz w:val="20"/>
                 <w:szCs w:val="20"/>
               </w:rPr>
-              <w:t xml:space="preserve">completamento da AVAILABLE e da FULL; uno stato completato è terminale (nessuna nuova prenotazione, nessuna doppia transizione); annullamento anche con passeggeri a bordo e relativa notifica Observer; uno stato annullato è terminale</w:t>
+              <w:t xml:space="preserve">completion from AVAILABLE and from FULL; a completed state is terminal (no new bookings, no double transition); cancellation even with passengers on board and the corresponding Observer notification; a cancelled state is terminal</w:t>
             </w:r>
           </w:p>
         </w:tc>
@@ -3249,7 +3249,7 @@
                 <w:sz w:val="20"/>
                 <w:szCs w:val="20"/>
               </w:rPr>
-              <w:t xml:space="preserve">salvataggio e rilettura tramite il database H2 reale (upsert via MERGE INTO, ricostruzione dello stato e dei passeggeri di un Ride, applicazione delle transizioni di un Booking); ogni test usa identificativi univoci (System.nanoTime()) per restare isolato nonostante il file H2 sia condiviso fra le esecuzioni</w:t>
+              <w:t xml:space="preserve">saving and reading back through the real H2 database (upsert via MERGE INTO, reconstruction of a Ride's state and passengers, application of a Booking's transitions); every test uses unique identifiers (System.nanoTime()) to stay isolated even though the H2 file is shared across runs</w:t>
             </w:r>
           </w:p>
         </w:tc>
@@ -3297,7 +3297,7 @@
                 <w:sz w:val="20"/>
                 <w:szCs w:val="20"/>
               </w:rPr>
-              <w:t xml:space="preserve">verifica che SqlDAOFactory restituisca effettivamente le implementazioni Jdbc*DAO e non uno stub</w:t>
+              <w:t xml:space="preserve">verifies that SqlDAOFactory actually returns the Jdbc*DAO implementations and not a stub</w:t>
             </w:r>
           </w:p>
         </w:tc>
@@ -3308,7 +3308,7 @@
         <w:spacing w:after="160"/>
       </w:pPr>
       <w:r>
-        <w:t xml:space="preserve">I test sullo strato di dominio istanziano direttamente le Entity (Ride, Booking) senza passare dai DAO o dalla Sessione, così da restare completamente deterministici e indipendenti dalla macchina su cui vengono eseguiti; i test sui Jdbc*DAO usano invece il vero database H2 embedded, a riprova che lo strato SQL non è solo dichiarato ma effettivamente funzionante. Il progetto include inoltre il plugin JaCoCo per la generazione del report di code coverage, letto automaticamente dall'analisi SonarCloud (vedi Deliverable Links a fine documento).</w:t>
+        <w:t xml:space="preserve">The domain-layer tests directly instantiate the Entities (Ride, Booking) without going through the DAOs or the Session, so they remain fully deterministic and independent of the machine they run on; the Jdbc*DAO tests, by contrast, use the real embedded H2 database, proving that the SQL layer is not just declared but actually functional. The project also includes the JaCoCo plugin to generate the code coverage report, automatically read by the SonarCloud analysis (see Deliverable Links at the end of the document).</w:t>
       </w:r>
     </w:p>
     <w:p>
@@ -3325,7 +3325,7 @@
         <w:spacing w:after="160"/>
       </w:pPr>
       <w:r>
-        <w:t xml:space="preserve">Come richiesto dalle Final Project Detailed Instructions, i deliverable delle sezioni 5 (Code) e 6 (Video) non sono riportati per intero in questo PDF, ma referenziati tramite i link seguenti.</w:t>
+        <w:t xml:space="preserve">As requested by the Final Project Detailed Instructions, the deliverables for sections 5 (Code) and 6 (Video) are not reproduced in full in this PDF, but referenced via the links below.</w:t>
       </w:r>
     </w:p>
     <w:p>
@@ -3337,7 +3337,7 @@
           <w:b/>
           <w:bCs/>
         </w:rPr>
-        <w:t xml:space="preserve">Codice sorgente (comprende anche i test JUnit)</w:t>
+        <w:t xml:space="preserve">Source code (also includes the JUnit tests)</w:t>
       </w:r>
       <w:r>
         <w:br/>
@@ -3353,7 +3353,7 @@
           <w:b/>
           <w:bCs/>
         </w:rPr>
-        <w:t xml:space="preserve">Analisi statica del codice (SonarCloud — 0 bug, 0 vulnerabilità, 0 code smell)</w:t>
+        <w:t xml:space="preserve">Static code analysis (SonarCloud — 0 bugs, 0 vulnerabilities, 0 code smells)</w:t>
       </w:r>
       <w:r>
         <w:br/>
@@ -3369,7 +3369,7 @@
           <w:b/>
           <w:bCs/>
         </w:rPr>
-        <w:t xml:space="preserve">Video dimostrativo (1–2 minuti, con audio)</w:t>
+        <w:t xml:space="preserve">Demo video (1–2 minutes, with audio)</w:t>
       </w:r>
       <w:r>
         <w:br/>

</xml_diff>

<commit_message>
Documentazione: Sequence Diagram (Fig. 10) ripristinato nella versione completa login->ricerca->prenotazione
Sostituita la versione semplificata con quella completa a 36 messaggi
attraverso 12 lifeline (Passeggero, 3 Boundary, 2 Controller, Session,
3 DAO, 2 Entity), come nel diagramma originale fornito dall'utente:
login con verifica hash password, navigazione dashboard->ricerca,
ricerca corse, richiesta di prenotazione con verifica anti-duplicati,
riserva del posto via Pattern State, notifica asincrona (Pattern
Observer) e persistenza del Booking. Testo tradotto in inglese per
coerenza col resto del documento, stile bianco/nero invariato.
</commit_message>
<xml_diff>
--- a/docs/UniRide_Submission.docx
+++ b/docs/UniRide_Submission.docx
@@ -2728,7 +2728,7 @@
       <w:r>
         <w:drawing>
           <wp:inline distT="0" distB="0" distL="0" distR="0">
-            <wp:extent cx="5715000" cy="2536760"/>
+            <wp:extent cx="5715000" cy="3775982"/>
             <wp:effectExtent t="0" r="0" b="0" l="0"/>
             <wp:docPr id="1" name="" descr="" title=""/>
             <wp:cNvGraphicFramePr>
@@ -2753,7 +2753,7 @@
                   <pic:spPr bwMode="auto">
                     <a:xfrm>
                       <a:off x="0" y="0"/>
-                      <a:ext cx="5715000" cy="2536760"/>
+                      <a:ext cx="5715000" cy="3775982"/>
                     </a:xfrm>
                     <a:prstGeom prst="rect">
                       <a:avLst/>

</xml_diff>

<commit_message>
Documentazione: FR riscritti senza 'shall allow/permit', verbo d'azione diretto
Su richiesta del professore, i 4 Functional Requirements non usano piu'
la forma indiretta 'The system shall allow/permit X to Y' ma il verbo
dell'azione descritta applicato direttamente al sistema (register,
authenticate, publish, complete, cancel, search, reserve, confirm,
reject).
</commit_message>
<xml_diff>
--- a/docs/UniRide_Submission.docx
+++ b/docs/UniRide_Submission.docx
@@ -1150,7 +1150,7 @@
           </w:p>
           <w:p>
             <w:r>
-              <w:t xml:space="preserve">The system shall allow a student to register with a username, password and personal details, and to log in with their credentials.</w:t>
+              <w:t xml:space="preserve">The system shall register a student with a username, password and personal details, and shall authenticate a student via their credentials.</w:t>
             </w:r>
           </w:p>
         </w:tc>
@@ -1205,7 +1205,7 @@
           </w:p>
           <w:p>
             <w:r>
-              <w:t xml:space="preserve">The system shall allow an authenticated driver to publish, complete or cancel their own ride.</w:t>
+              <w:t xml:space="preserve">The system shall publish, complete, or cancel a ride on behalf of an authenticated driver.</w:t>
             </w:r>
           </w:p>
         </w:tc>
@@ -1260,7 +1260,7 @@
           </w:p>
           <w:p>
             <w:r>
-              <w:t xml:space="preserve">The system shall allow an authenticated passenger to search for an available ride and request a seat, which is reserved immediately.</w:t>
+              <w:t xml:space="preserve">The system shall search available rides and reserve a seat immediately upon an authenticated passenger's request.</w:t>
             </w:r>
           </w:p>
         </w:tc>
@@ -1315,7 +1315,7 @@
           </w:p>
           <w:p>
             <w:r>
-              <w:t xml:space="preserve">The system shall allow the driver to confirm or reject a booking request, and both parties to cancel it at any time.</w:t>
+              <w:t xml:space="preserve">The system shall confirm or reject a booking request on behalf of the driver, and shall cancel it on behalf of either party at any time.</w:t>
             </w:r>
           </w:p>
         </w:tc>

</xml_diff>

<commit_message>
Documentazione: Activity Diagram (Fig. 9) riprogettato in stile UML puro (rif. SunBook)
Aggiunti gli elementi UML mancanti rispetto all'esempio del professore:
tre diamanti di decisione con anello di retry (nessun risultato, corsa
propria, richiesta gia' attiva), una coppia fork/join (barra nera) per
la creazione asincrona della notifica Observer in parallelo alla
persistenza del Booking, nodo hourglass per l'attesa della risposta del
guidatore, due nodi finali. Bianco e nero puro come il resto dei
diagrammi rifatti in stile SunBook in precedenza.
</commit_message>
<xml_diff>
--- a/docs/UniRide_Submission.docx
+++ b/docs/UniRide_Submission.docx
@@ -2649,7 +2649,7 @@
       <w:r>
         <w:drawing>
           <wp:inline distT="0" distB="0" distL="0" distR="0">
-            <wp:extent cx="4572000" cy="8226903"/>
+            <wp:extent cx="4118665" cy="8500000"/>
             <wp:effectExtent t="0" r="0" b="0" l="0"/>
             <wp:docPr id="1" name="" descr="" title=""/>
             <wp:cNvGraphicFramePr>
@@ -2674,7 +2674,7 @@
                   <pic:spPr bwMode="auto">
                     <a:xfrm>
                       <a:off x="0" y="0"/>
-                      <a:ext cx="4572000" cy="8226903"/>
+                      <a:ext cx="4118665" cy="8500000"/>
                     </a:xfrm>
                     <a:prstGeom prst="rect">
                       <a:avLst/>

</xml_diff>

<commit_message>
Documentazione: Activity Diagram (Fig. 9) ridisegnato con draw.io
Sostituito il rendering Mermaid con un diagramma costruito direttamente
in draw.io (mxGraph), stesso contenuto/struttura della versione
precedente (decision diamond con retry, fork/join, hourglass, note
finali) ma con notazione UML piu' fedele: nodo finale a bersaglio
(anello + pallino nero) invece del cerchio pieno, connettori
ortogonali puliti, tipografia e spaziatura piu' curate.
</commit_message>
<xml_diff>
--- a/docs/UniRide_Submission.docx
+++ b/docs/UniRide_Submission.docx
@@ -2649,7 +2649,7 @@
       <w:r>
         <w:drawing>
           <wp:inline distT="0" distB="0" distL="0" distR="0">
-            <wp:extent cx="4118665" cy="8500000"/>
+            <wp:extent cx="4146193" cy="8500001"/>
             <wp:effectExtent t="0" r="0" b="0" l="0"/>
             <wp:docPr id="1" name="" descr="" title=""/>
             <wp:cNvGraphicFramePr>
@@ -2674,7 +2674,7 @@
                   <pic:spPr bwMode="auto">
                     <a:xfrm>
                       <a:off x="0" y="0"/>
-                      <a:ext cx="4118665" cy="8500000"/>
+                      <a:ext cx="4146193" cy="8500001"/>
                     </a:xfrm>
                     <a:prstGeom prst="rect">
                       <a:avLst/>

</xml_diff>

<commit_message>
Documentazione: FR-1..4 semplificati a una singola azione ciascuno
Su richiesta, ridotti a un'unica frase 'shall + verbo' per requisito,
rimuovendo le azioni secondarie elencate (login/logout, complete/cancel,
reserve seat, reject/cancel) che restano comunque coperte a livello di
dettaglio nei relativi Use Case e diagrammi di stato.
</commit_message>
<xml_diff>
--- a/docs/UniRide_Submission.docx
+++ b/docs/UniRide_Submission.docx
@@ -1150,7 +1150,7 @@
           </w:p>
           <w:p>
             <w:r>
-              <w:t xml:space="preserve">The system shall register a student with a username, password and personal details, and shall authenticate a student via their credentials.</w:t>
+              <w:t xml:space="preserve">The system shall register a student with a username, password and personal details.</w:t>
             </w:r>
           </w:p>
         </w:tc>
@@ -1205,7 +1205,7 @@
           </w:p>
           <w:p>
             <w:r>
-              <w:t xml:space="preserve">The system shall publish, complete, or cancel a ride on behalf of an authenticated driver.</w:t>
+              <w:t xml:space="preserve">The system shall publish a ride on behalf of an authenticated driver.</w:t>
             </w:r>
           </w:p>
         </w:tc>
@@ -1260,7 +1260,7 @@
           </w:p>
           <w:p>
             <w:r>
-              <w:t xml:space="preserve">The system shall search available rides and reserve a seat immediately upon an authenticated passenger's request.</w:t>
+              <w:t xml:space="preserve">The system shall search available rides upon an authenticated passenger's request.</w:t>
             </w:r>
           </w:p>
         </w:tc>
@@ -1315,7 +1315,7 @@
           </w:p>
           <w:p>
             <w:r>
-              <w:t xml:space="preserve">The system shall confirm or reject a booking request on behalf of the driver, and shall cancel it on behalf of either party at any time.</w:t>
+              <w:t xml:space="preserve">The system shall confirm a booking request on behalf of the driver.</w:t>
             </w:r>
           </w:p>
         </w:tc>

</xml_diff>